<commit_message>
Fix : Dasboard and Report
</commit_message>
<xml_diff>
--- a/docs/dokumentasi.docx
+++ b/docs/dokumentasi.docx
@@ -363,20 +363,35 @@
     <w:p>
       <w:pPr>
         <w:pStyle w:val="Heading1"/>
+        <w:rPr>
+          <w:rFonts w:cs="Times New Roman"/>
+        </w:rPr>
       </w:pPr>
       <w:r>
+        <w:rPr>
+          <w:rFonts w:cs="Times New Roman"/>
+        </w:rPr>
         <w:t xml:space="preserve">A. </w:t>
       </w:r>
       <w:proofErr w:type="spellStart"/>
       <w:r>
+        <w:rPr>
+          <w:rFonts w:cs="Times New Roman"/>
+        </w:rPr>
         <w:t>Deskripsi</w:t>
       </w:r>
       <w:proofErr w:type="spellEnd"/>
       <w:r>
-        <w:t xml:space="preserve"> </w:t>
-      </w:r>
-      <w:proofErr w:type="spellStart"/>
-      <w:r>
+        <w:rPr>
+          <w:rFonts w:cs="Times New Roman"/>
+        </w:rPr>
+        <w:t xml:space="preserve"> </w:t>
+      </w:r>
+      <w:proofErr w:type="spellStart"/>
+      <w:r>
+        <w:rPr>
+          <w:rFonts w:cs="Times New Roman"/>
+        </w:rPr>
         <w:t>Proyek</w:t>
       </w:r>
       <w:proofErr w:type="spellEnd"/>
@@ -1303,6 +1318,8 @@
         <w:jc w:val="both"/>
         <w:rPr>
           <w:rFonts w:ascii="Times New Roman" w:hAnsi="Times New Roman" w:cs="Times New Roman"/>
+          <w:sz w:val="24"/>
+          <w:szCs w:val="24"/>
         </w:rPr>
       </w:pPr>
       <w:proofErr w:type="spellStart"/>
@@ -1841,20 +1858,35 @@
     <w:p>
       <w:pPr>
         <w:pStyle w:val="Heading1"/>
+        <w:rPr>
+          <w:rFonts w:cs="Times New Roman"/>
+        </w:rPr>
       </w:pPr>
       <w:r>
+        <w:rPr>
+          <w:rFonts w:cs="Times New Roman"/>
+        </w:rPr>
         <w:t xml:space="preserve">B. </w:t>
       </w:r>
       <w:proofErr w:type="spellStart"/>
       <w:r>
+        <w:rPr>
+          <w:rFonts w:cs="Times New Roman"/>
+        </w:rPr>
         <w:t>Arsitektur</w:t>
       </w:r>
       <w:proofErr w:type="spellEnd"/>
       <w:r>
+        <w:rPr>
+          <w:rFonts w:cs="Times New Roman"/>
+        </w:rPr>
         <w:t xml:space="preserve"> &amp; Model </w:t>
       </w:r>
       <w:proofErr w:type="spellStart"/>
       <w:r>
+        <w:rPr>
+          <w:rFonts w:cs="Times New Roman"/>
+        </w:rPr>
         <w:t>dbt</w:t>
       </w:r>
       <w:proofErr w:type="spellEnd"/>
@@ -2089,6 +2121,8 @@
         <w:jc w:val="both"/>
         <w:rPr>
           <w:rFonts w:ascii="Times New Roman" w:hAnsi="Times New Roman" w:cs="Times New Roman"/>
+          <w:sz w:val="24"/>
+          <w:szCs w:val="24"/>
         </w:rPr>
       </w:pPr>
       <w:r>
@@ -2896,7 +2930,7 @@
         </w:rPr>
         <w:lastRenderedPageBreak/>
         <w:drawing>
-          <wp:inline distT="0" distB="0" distL="0" distR="0" wp14:anchorId="6B2D992B" wp14:editId="4F59E5DB">
+          <wp:inline distT="0" distB="0" distL="0" distR="0" wp14:anchorId="6A7C3A95" wp14:editId="3AE04404">
             <wp:extent cx="4762500" cy="2428875"/>
             <wp:effectExtent l="0" t="0" r="0" b="0"/>
             <wp:docPr id="1" name="Picture 1"/>
@@ -3115,7 +3149,7 @@
           <w:noProof/>
         </w:rPr>
         <w:drawing>
-          <wp:inline distT="0" distB="0" distL="0" distR="0" wp14:anchorId="46D3D74D" wp14:editId="47F78F85">
+          <wp:inline distT="0" distB="0" distL="0" distR="0" wp14:anchorId="489E17C8" wp14:editId="740334AF">
             <wp:extent cx="4762500" cy="1762125"/>
             <wp:effectExtent l="0" t="0" r="0" b="0"/>
             <wp:docPr id="2" name="Picture 2"/>
@@ -3297,8 +3331,14 @@
     <w:p>
       <w:pPr>
         <w:pStyle w:val="Heading1"/>
+        <w:rPr>
+          <w:rFonts w:cs="Times New Roman"/>
+        </w:rPr>
       </w:pPr>
       <w:r>
+        <w:rPr>
+          <w:rFonts w:cs="Times New Roman"/>
+        </w:rPr>
         <w:t>C. Tests &amp; Data Quality</w:t>
       </w:r>
     </w:p>
@@ -4153,6 +4193,7 @@
           </w:tcPr>
           <w:p>
             <w:pPr>
+              <w:spacing w:line="360" w:lineRule="auto"/>
               <w:rPr>
                 <w:rFonts w:ascii="Times New Roman" w:hAnsi="Times New Roman" w:cs="Times New Roman"/>
                 <w:sz w:val="24"/>
@@ -4195,6 +4236,7 @@
           </w:tcPr>
           <w:p>
             <w:pPr>
+              <w:spacing w:line="360" w:lineRule="auto"/>
               <w:rPr>
                 <w:rFonts w:ascii="Times New Roman" w:hAnsi="Times New Roman" w:cs="Times New Roman"/>
                 <w:sz w:val="24"/>
@@ -4227,6 +4269,7 @@
           </w:tcPr>
           <w:p>
             <w:pPr>
+              <w:spacing w:line="360" w:lineRule="auto"/>
               <w:rPr>
                 <w:rFonts w:ascii="Times New Roman" w:hAnsi="Times New Roman" w:cs="Times New Roman"/>
                 <w:sz w:val="24"/>
@@ -4271,6 +4314,7 @@
           </w:tcPr>
           <w:p>
             <w:pPr>
+              <w:spacing w:line="360" w:lineRule="auto"/>
               <w:rPr>
                 <w:rFonts w:ascii="Times New Roman" w:hAnsi="Times New Roman" w:cs="Times New Roman"/>
                 <w:sz w:val="24"/>
@@ -4281,7 +4325,6 @@
             <w:r>
               <w:rPr>
                 <w:rFonts w:ascii="Times New Roman" w:hAnsi="Times New Roman" w:cs="Times New Roman"/>
-                <w:color w:val="222222"/>
                 <w:sz w:val="24"/>
                 <w:szCs w:val="24"/>
               </w:rPr>
@@ -4291,7 +4334,6 @@
             <w:r>
               <w:rPr>
                 <w:rFonts w:ascii="Times New Roman" w:hAnsi="Times New Roman" w:cs="Times New Roman"/>
-                <w:color w:val="222222"/>
                 <w:sz w:val="24"/>
                 <w:szCs w:val="24"/>
               </w:rPr>
@@ -4311,6 +4353,7 @@
           </w:tcPr>
           <w:p>
             <w:pPr>
+              <w:spacing w:line="360" w:lineRule="auto"/>
               <w:rPr>
                 <w:rFonts w:ascii="Times New Roman" w:hAnsi="Times New Roman" w:cs="Times New Roman"/>
                 <w:sz w:val="24"/>
@@ -4320,7 +4363,6 @@
             <w:r>
               <w:rPr>
                 <w:rFonts w:ascii="Times New Roman" w:hAnsi="Times New Roman" w:cs="Times New Roman"/>
-                <w:color w:val="222222"/>
                 <w:sz w:val="24"/>
                 <w:szCs w:val="24"/>
               </w:rPr>
@@ -4340,6 +4382,7 @@
           </w:tcPr>
           <w:p>
             <w:pPr>
+              <w:spacing w:line="360" w:lineRule="auto"/>
               <w:rPr>
                 <w:rFonts w:ascii="Times New Roman" w:hAnsi="Times New Roman" w:cs="Times New Roman"/>
                 <w:sz w:val="24"/>
@@ -4349,7 +4392,6 @@
             <w:r>
               <w:rPr>
                 <w:rFonts w:ascii="Times New Roman" w:hAnsi="Times New Roman" w:cs="Times New Roman"/>
-                <w:color w:val="222222"/>
                 <w:sz w:val="24"/>
                 <w:szCs w:val="24"/>
               </w:rPr>
@@ -4359,7 +4401,6 @@
             <w:r>
               <w:rPr>
                 <w:rFonts w:ascii="Times New Roman" w:hAnsi="Times New Roman" w:cs="Times New Roman"/>
-                <w:color w:val="222222"/>
                 <w:sz w:val="24"/>
                 <w:szCs w:val="24"/>
               </w:rPr>
@@ -4382,6 +4423,7 @@
           </w:tcPr>
           <w:p>
             <w:pPr>
+              <w:spacing w:line="360" w:lineRule="auto"/>
               <w:rPr>
                 <w:rFonts w:ascii="Times New Roman" w:hAnsi="Times New Roman" w:cs="Times New Roman"/>
                 <w:sz w:val="24"/>
@@ -4391,7 +4433,6 @@
             <w:r>
               <w:rPr>
                 <w:rFonts w:ascii="Times New Roman" w:hAnsi="Times New Roman" w:cs="Times New Roman"/>
-                <w:color w:val="222222"/>
                 <w:sz w:val="24"/>
                 <w:szCs w:val="24"/>
               </w:rPr>
@@ -4411,6 +4452,7 @@
           </w:tcPr>
           <w:p>
             <w:pPr>
+              <w:spacing w:line="360" w:lineRule="auto"/>
               <w:rPr>
                 <w:rFonts w:ascii="Times New Roman" w:hAnsi="Times New Roman" w:cs="Times New Roman"/>
                 <w:sz w:val="24"/>
@@ -4420,7 +4462,6 @@
             <w:r>
               <w:rPr>
                 <w:rFonts w:ascii="Times New Roman" w:hAnsi="Times New Roman" w:cs="Times New Roman"/>
-                <w:color w:val="222222"/>
                 <w:sz w:val="24"/>
                 <w:szCs w:val="24"/>
               </w:rPr>
@@ -4440,6 +4481,7 @@
           </w:tcPr>
           <w:p>
             <w:pPr>
+              <w:spacing w:line="360" w:lineRule="auto"/>
               <w:rPr>
                 <w:rFonts w:ascii="Times New Roman" w:hAnsi="Times New Roman" w:cs="Times New Roman"/>
                 <w:sz w:val="24"/>
@@ -4450,7 +4492,6 @@
             <w:r>
               <w:rPr>
                 <w:rFonts w:ascii="Times New Roman" w:hAnsi="Times New Roman" w:cs="Times New Roman"/>
-                <w:color w:val="222222"/>
                 <w:sz w:val="24"/>
                 <w:szCs w:val="24"/>
               </w:rPr>
@@ -4460,7 +4501,6 @@
             <w:r>
               <w:rPr>
                 <w:rFonts w:ascii="Times New Roman" w:hAnsi="Times New Roman" w:cs="Times New Roman"/>
-                <w:color w:val="222222"/>
                 <w:sz w:val="24"/>
                 <w:szCs w:val="24"/>
               </w:rPr>
@@ -4482,6 +4522,7 @@
           </w:tcPr>
           <w:p>
             <w:pPr>
+              <w:spacing w:line="360" w:lineRule="auto"/>
               <w:rPr>
                 <w:rFonts w:ascii="Times New Roman" w:hAnsi="Times New Roman" w:cs="Times New Roman"/>
                 <w:sz w:val="24"/>
@@ -4491,7 +4532,6 @@
             <w:r>
               <w:rPr>
                 <w:rFonts w:ascii="Times New Roman" w:hAnsi="Times New Roman" w:cs="Times New Roman"/>
-                <w:color w:val="222222"/>
                 <w:sz w:val="24"/>
                 <w:szCs w:val="24"/>
               </w:rPr>
@@ -4511,6 +4551,7 @@
           </w:tcPr>
           <w:p>
             <w:pPr>
+              <w:spacing w:line="360" w:lineRule="auto"/>
               <w:rPr>
                 <w:rFonts w:ascii="Times New Roman" w:hAnsi="Times New Roman" w:cs="Times New Roman"/>
                 <w:sz w:val="24"/>
@@ -4520,7 +4561,6 @@
             <w:r>
               <w:rPr>
                 <w:rFonts w:ascii="Times New Roman" w:hAnsi="Times New Roman" w:cs="Times New Roman"/>
-                <w:color w:val="222222"/>
                 <w:sz w:val="24"/>
                 <w:szCs w:val="24"/>
               </w:rPr>
@@ -4540,6 +4580,7 @@
           </w:tcPr>
           <w:p>
             <w:pPr>
+              <w:spacing w:line="360" w:lineRule="auto"/>
               <w:rPr>
                 <w:rFonts w:ascii="Times New Roman" w:hAnsi="Times New Roman" w:cs="Times New Roman"/>
                 <w:sz w:val="24"/>
@@ -4549,7 +4590,6 @@
             <w:r>
               <w:rPr>
                 <w:rFonts w:ascii="Times New Roman" w:hAnsi="Times New Roman" w:cs="Times New Roman"/>
-                <w:color w:val="222222"/>
                 <w:sz w:val="24"/>
                 <w:szCs w:val="24"/>
               </w:rPr>
@@ -4559,7 +4599,6 @@
             <w:r>
               <w:rPr>
                 <w:rFonts w:ascii="Times New Roman" w:hAnsi="Times New Roman" w:cs="Times New Roman"/>
-                <w:color w:val="222222"/>
                 <w:sz w:val="24"/>
                 <w:szCs w:val="24"/>
               </w:rPr>
@@ -4582,6 +4621,7 @@
           </w:tcPr>
           <w:p>
             <w:pPr>
+              <w:spacing w:line="360" w:lineRule="auto"/>
               <w:rPr>
                 <w:rFonts w:ascii="Times New Roman" w:hAnsi="Times New Roman" w:cs="Times New Roman"/>
                 <w:sz w:val="24"/>
@@ -4591,7 +4631,6 @@
             <w:r>
               <w:rPr>
                 <w:rFonts w:ascii="Times New Roman" w:hAnsi="Times New Roman" w:cs="Times New Roman"/>
-                <w:color w:val="222222"/>
                 <w:sz w:val="24"/>
                 <w:szCs w:val="24"/>
               </w:rPr>
@@ -4601,7 +4640,6 @@
             <w:r>
               <w:rPr>
                 <w:rFonts w:ascii="Times New Roman" w:hAnsi="Times New Roman" w:cs="Times New Roman"/>
-                <w:color w:val="222222"/>
                 <w:sz w:val="24"/>
                 <w:szCs w:val="24"/>
               </w:rPr>
@@ -4622,6 +4660,7 @@
           </w:tcPr>
           <w:p>
             <w:pPr>
+              <w:spacing w:line="360" w:lineRule="auto"/>
               <w:rPr>
                 <w:rFonts w:ascii="Times New Roman" w:hAnsi="Times New Roman" w:cs="Times New Roman"/>
                 <w:sz w:val="24"/>
@@ -4631,7 +4670,6 @@
             <w:r>
               <w:rPr>
                 <w:rFonts w:ascii="Times New Roman" w:hAnsi="Times New Roman" w:cs="Times New Roman"/>
-                <w:color w:val="222222"/>
                 <w:sz w:val="24"/>
                 <w:szCs w:val="24"/>
               </w:rPr>
@@ -4651,6 +4689,7 @@
           </w:tcPr>
           <w:p>
             <w:pPr>
+              <w:spacing w:line="360" w:lineRule="auto"/>
               <w:rPr>
                 <w:rFonts w:ascii="Times New Roman" w:hAnsi="Times New Roman" w:cs="Times New Roman"/>
                 <w:sz w:val="24"/>
@@ -4660,7 +4699,6 @@
             <w:r>
               <w:rPr>
                 <w:rFonts w:ascii="Times New Roman" w:hAnsi="Times New Roman" w:cs="Times New Roman"/>
-                <w:color w:val="222222"/>
                 <w:sz w:val="24"/>
                 <w:szCs w:val="24"/>
               </w:rPr>
@@ -4670,7 +4708,6 @@
             <w:r>
               <w:rPr>
                 <w:rFonts w:ascii="Times New Roman" w:hAnsi="Times New Roman" w:cs="Times New Roman"/>
-                <w:color w:val="222222"/>
                 <w:sz w:val="24"/>
                 <w:szCs w:val="24"/>
               </w:rPr>
@@ -4693,6 +4730,7 @@
           </w:tcPr>
           <w:p>
             <w:pPr>
+              <w:spacing w:line="360" w:lineRule="auto"/>
               <w:rPr>
                 <w:rFonts w:ascii="Times New Roman" w:hAnsi="Times New Roman" w:cs="Times New Roman"/>
                 <w:sz w:val="24"/>
@@ -4702,7 +4740,6 @@
             <w:r>
               <w:rPr>
                 <w:rFonts w:ascii="Times New Roman" w:hAnsi="Times New Roman" w:cs="Times New Roman"/>
-                <w:color w:val="222222"/>
                 <w:sz w:val="24"/>
                 <w:szCs w:val="24"/>
               </w:rPr>
@@ -4712,7 +4749,6 @@
             <w:r>
               <w:rPr>
                 <w:rFonts w:ascii="Times New Roman" w:hAnsi="Times New Roman" w:cs="Times New Roman"/>
-                <w:color w:val="222222"/>
                 <w:sz w:val="24"/>
                 <w:szCs w:val="24"/>
               </w:rPr>
@@ -4733,6 +4769,7 @@
           </w:tcPr>
           <w:p>
             <w:pPr>
+              <w:spacing w:line="360" w:lineRule="auto"/>
               <w:rPr>
                 <w:rFonts w:ascii="Times New Roman" w:hAnsi="Times New Roman" w:cs="Times New Roman"/>
                 <w:sz w:val="24"/>
@@ -4742,7 +4779,6 @@
             <w:r>
               <w:rPr>
                 <w:rFonts w:ascii="Times New Roman" w:hAnsi="Times New Roman" w:cs="Times New Roman"/>
-                <w:color w:val="222222"/>
                 <w:sz w:val="24"/>
                 <w:szCs w:val="24"/>
               </w:rPr>
@@ -4762,6 +4798,7 @@
           </w:tcPr>
           <w:p>
             <w:pPr>
+              <w:spacing w:line="360" w:lineRule="auto"/>
               <w:rPr>
                 <w:rFonts w:ascii="Times New Roman" w:hAnsi="Times New Roman" w:cs="Times New Roman"/>
                 <w:sz w:val="24"/>
@@ -4772,7 +4809,6 @@
             <w:r>
               <w:rPr>
                 <w:rFonts w:ascii="Times New Roman" w:hAnsi="Times New Roman" w:cs="Times New Roman"/>
-                <w:color w:val="222222"/>
                 <w:sz w:val="24"/>
                 <w:szCs w:val="24"/>
               </w:rPr>
@@ -4782,7 +4818,6 @@
             <w:r>
               <w:rPr>
                 <w:rFonts w:ascii="Times New Roman" w:hAnsi="Times New Roman" w:cs="Times New Roman"/>
-                <w:color w:val="222222"/>
                 <w:sz w:val="24"/>
                 <w:szCs w:val="24"/>
               </w:rPr>
@@ -4804,6 +4839,7 @@
           </w:tcPr>
           <w:p>
             <w:pPr>
+              <w:spacing w:line="360" w:lineRule="auto"/>
               <w:rPr>
                 <w:rFonts w:ascii="Times New Roman" w:hAnsi="Times New Roman" w:cs="Times New Roman"/>
                 <w:sz w:val="24"/>
@@ -4814,17 +4850,16 @@
             <w:r>
               <w:rPr>
                 <w:rFonts w:ascii="Times New Roman" w:hAnsi="Times New Roman" w:cs="Times New Roman"/>
-                <w:color w:val="222222"/>
                 <w:sz w:val="24"/>
                 <w:szCs w:val="24"/>
               </w:rPr>
+              <w:lastRenderedPageBreak/>
               <w:t>Duplikat</w:t>
             </w:r>
             <w:proofErr w:type="spellEnd"/>
             <w:r>
               <w:rPr>
                 <w:rFonts w:ascii="Times New Roman" w:hAnsi="Times New Roman" w:cs="Times New Roman"/>
-                <w:color w:val="222222"/>
                 <w:sz w:val="24"/>
                 <w:szCs w:val="24"/>
               </w:rPr>
@@ -4834,7 +4869,6 @@
             <w:r>
               <w:rPr>
                 <w:rFonts w:ascii="Times New Roman" w:hAnsi="Times New Roman" w:cs="Times New Roman"/>
-                <w:color w:val="222222"/>
                 <w:sz w:val="24"/>
                 <w:szCs w:val="24"/>
               </w:rPr>
@@ -4844,7 +4878,6 @@
             <w:r>
               <w:rPr>
                 <w:rFonts w:ascii="Times New Roman" w:hAnsi="Times New Roman" w:cs="Times New Roman"/>
-                <w:color w:val="222222"/>
                 <w:sz w:val="24"/>
                 <w:szCs w:val="24"/>
               </w:rPr>
@@ -4864,6 +4897,7 @@
           </w:tcPr>
           <w:p>
             <w:pPr>
+              <w:spacing w:line="360" w:lineRule="auto"/>
               <w:rPr>
                 <w:rFonts w:ascii="Times New Roman" w:hAnsi="Times New Roman" w:cs="Times New Roman"/>
                 <w:sz w:val="24"/>
@@ -4873,7 +4907,6 @@
             <w:r>
               <w:rPr>
                 <w:rFonts w:ascii="Times New Roman" w:hAnsi="Times New Roman" w:cs="Times New Roman"/>
-                <w:color w:val="222222"/>
                 <w:sz w:val="24"/>
                 <w:szCs w:val="24"/>
               </w:rPr>
@@ -4893,6 +4926,7 @@
           </w:tcPr>
           <w:p>
             <w:pPr>
+              <w:spacing w:line="360" w:lineRule="auto"/>
               <w:rPr>
                 <w:rFonts w:ascii="Times New Roman" w:hAnsi="Times New Roman" w:cs="Times New Roman"/>
                 <w:sz w:val="24"/>
@@ -4902,7 +4936,6 @@
             <w:r>
               <w:rPr>
                 <w:rFonts w:ascii="Times New Roman" w:hAnsi="Times New Roman" w:cs="Times New Roman"/>
-                <w:color w:val="222222"/>
                 <w:sz w:val="24"/>
                 <w:szCs w:val="24"/>
               </w:rPr>
@@ -4912,7 +4945,6 @@
             <w:r>
               <w:rPr>
                 <w:rFonts w:ascii="Times New Roman" w:hAnsi="Times New Roman" w:cs="Times New Roman"/>
-                <w:color w:val="222222"/>
                 <w:sz w:val="24"/>
                 <w:szCs w:val="24"/>
               </w:rPr>
@@ -4922,7 +4954,6 @@
             <w:r>
               <w:rPr>
                 <w:rFonts w:ascii="Times New Roman" w:hAnsi="Times New Roman" w:cs="Times New Roman"/>
-                <w:color w:val="222222"/>
                 <w:sz w:val="24"/>
                 <w:szCs w:val="24"/>
               </w:rPr>
@@ -4950,7 +4981,6 @@
           <w:sz w:val="24"/>
           <w:szCs w:val="24"/>
         </w:rPr>
-        <w:lastRenderedPageBreak/>
         <w:t xml:space="preserve">Satu baris </w:t>
       </w:r>
       <w:proofErr w:type="spellStart"/>
@@ -5408,7 +5438,7 @@
           <w:noProof/>
         </w:rPr>
         <w:drawing>
-          <wp:inline distT="0" distB="0" distL="0" distR="0" wp14:anchorId="7F49C664" wp14:editId="4C4CEBCE">
+          <wp:inline distT="0" distB="0" distL="0" distR="0" wp14:anchorId="3A092665" wp14:editId="0C12BE3F">
             <wp:extent cx="4762500" cy="2571750"/>
             <wp:effectExtent l="0" t="0" r="0" b="0"/>
             <wp:docPr id="3" name="Picture 3"/>
@@ -5590,8 +5620,14 @@
     <w:p>
       <w:pPr>
         <w:pStyle w:val="Heading1"/>
+        <w:rPr>
+          <w:rFonts w:cs="Times New Roman"/>
+        </w:rPr>
       </w:pPr>
       <w:r>
+        <w:rPr>
+          <w:rFonts w:cs="Times New Roman"/>
+        </w:rPr>
         <w:t>D. Dashboard</w:t>
       </w:r>
     </w:p>
@@ -6033,7 +6069,27 @@
           <w:sz w:val="24"/>
           <w:szCs w:val="24"/>
         </w:rPr>
-        <w:t xml:space="preserve">: list slicer (single select </w:t>
+        <w:t xml:space="preserve">: tile slicer </w:t>
+      </w:r>
+      <w:proofErr w:type="spellStart"/>
+      <w:r>
+        <w:rPr>
+          <w:rFonts w:ascii="Times New Roman" w:hAnsi="Times New Roman" w:cs="Times New Roman"/>
+          <w:color w:val="222222"/>
+          <w:sz w:val="24"/>
+          <w:szCs w:val="24"/>
+        </w:rPr>
+        <w:t>kategori</w:t>
+      </w:r>
+      <w:proofErr w:type="spellEnd"/>
+      <w:r>
+        <w:rPr>
+          <w:rFonts w:ascii="Times New Roman" w:hAnsi="Times New Roman" w:cs="Times New Roman"/>
+          <w:color w:val="222222"/>
+          <w:sz w:val="24"/>
+          <w:szCs w:val="24"/>
+        </w:rPr>
+        <w:t xml:space="preserve"> (Electronics, Fashion, Groceries, Home; single select </w:t>
       </w:r>
       <w:proofErr w:type="spellStart"/>
       <w:r>
@@ -6053,47 +6109,107 @@
           <w:sz w:val="24"/>
           <w:szCs w:val="24"/>
         </w:rPr>
-        <w:t xml:space="preserve">) pada </w:t>
-      </w:r>
-      <w:proofErr w:type="spellStart"/>
-      <w:r>
-        <w:rPr>
-          <w:rFonts w:ascii="Times New Roman" w:hAnsi="Times New Roman" w:cs="Times New Roman"/>
-          <w:color w:val="222222"/>
-          <w:sz w:val="24"/>
-          <w:szCs w:val="24"/>
-        </w:rPr>
-        <w:t>kategori</w:t>
-      </w:r>
-      <w:proofErr w:type="spellEnd"/>
-      <w:r>
-        <w:rPr>
-          <w:rFonts w:ascii="Times New Roman" w:hAnsi="Times New Roman" w:cs="Times New Roman"/>
-          <w:color w:val="222222"/>
-          <w:sz w:val="24"/>
-          <w:szCs w:val="24"/>
-        </w:rPr>
-        <w:t xml:space="preserve">, wilayah, dan </w:t>
-      </w:r>
-      <w:proofErr w:type="spellStart"/>
-      <w:r>
-        <w:rPr>
-          <w:rFonts w:ascii="Times New Roman" w:hAnsi="Times New Roman" w:cs="Times New Roman"/>
-          <w:color w:val="222222"/>
-          <w:sz w:val="24"/>
-          <w:szCs w:val="24"/>
-        </w:rPr>
-        <w:t>tahun</w:t>
-      </w:r>
-      <w:proofErr w:type="spellEnd"/>
-      <w:r>
-        <w:rPr>
-          <w:rFonts w:ascii="Times New Roman" w:hAnsi="Times New Roman" w:cs="Times New Roman"/>
-          <w:color w:val="222222"/>
-          <w:sz w:val="24"/>
-          <w:szCs w:val="24"/>
-        </w:rPr>
-        <w:t xml:space="preserve">, plus </w:t>
+        <w:t xml:space="preserve">), dropdown wilayah, dan slicer </w:t>
+      </w:r>
+      <w:proofErr w:type="spellStart"/>
+      <w:r>
+        <w:rPr>
+          <w:rFonts w:ascii="Times New Roman" w:hAnsi="Times New Roman" w:cs="Times New Roman"/>
+          <w:color w:val="222222"/>
+          <w:sz w:val="24"/>
+          <w:szCs w:val="24"/>
+        </w:rPr>
+        <w:t>rentang</w:t>
+      </w:r>
+      <w:proofErr w:type="spellEnd"/>
+      <w:r>
+        <w:rPr>
+          <w:rFonts w:ascii="Times New Roman" w:hAnsi="Times New Roman" w:cs="Times New Roman"/>
+          <w:color w:val="222222"/>
+          <w:sz w:val="24"/>
+          <w:szCs w:val="24"/>
+        </w:rPr>
+        <w:t xml:space="preserve"> </w:t>
+      </w:r>
+      <w:proofErr w:type="spellStart"/>
+      <w:r>
+        <w:rPr>
+          <w:rFonts w:ascii="Times New Roman" w:hAnsi="Times New Roman" w:cs="Times New Roman"/>
+          <w:color w:val="222222"/>
+          <w:sz w:val="24"/>
+          <w:szCs w:val="24"/>
+        </w:rPr>
+        <w:t>Tanggal</w:t>
+      </w:r>
+      <w:proofErr w:type="spellEnd"/>
+      <w:r>
+        <w:rPr>
+          <w:rFonts w:ascii="Times New Roman" w:hAnsi="Times New Roman" w:cs="Times New Roman"/>
+          <w:color w:val="222222"/>
+          <w:sz w:val="24"/>
+          <w:szCs w:val="24"/>
+        </w:rPr>
+        <w:t xml:space="preserve"> Order (18 </w:t>
+      </w:r>
+      <w:proofErr w:type="spellStart"/>
+      <w:r>
+        <w:rPr>
+          <w:rFonts w:ascii="Times New Roman" w:hAnsi="Times New Roman" w:cs="Times New Roman"/>
+          <w:color w:val="222222"/>
+          <w:sz w:val="24"/>
+          <w:szCs w:val="24"/>
+        </w:rPr>
+        <w:t>Februari</w:t>
+      </w:r>
+      <w:proofErr w:type="spellEnd"/>
+      <w:r>
+        <w:rPr>
+          <w:rFonts w:ascii="Times New Roman" w:hAnsi="Times New Roman" w:cs="Times New Roman"/>
+          <w:color w:val="222222"/>
+          <w:sz w:val="24"/>
+          <w:szCs w:val="24"/>
+        </w:rPr>
+        <w:t xml:space="preserve"> 2024–17 </w:t>
+      </w:r>
+      <w:proofErr w:type="spellStart"/>
+      <w:r>
+        <w:rPr>
+          <w:rFonts w:ascii="Times New Roman" w:hAnsi="Times New Roman" w:cs="Times New Roman"/>
+          <w:color w:val="222222"/>
+          <w:sz w:val="24"/>
+          <w:szCs w:val="24"/>
+        </w:rPr>
+        <w:t>Februari</w:t>
+      </w:r>
+      <w:proofErr w:type="spellEnd"/>
+      <w:r>
+        <w:rPr>
+          <w:rFonts w:ascii="Times New Roman" w:hAnsi="Times New Roman" w:cs="Times New Roman"/>
+          <w:color w:val="222222"/>
+          <w:sz w:val="24"/>
+          <w:szCs w:val="24"/>
+        </w:rPr>
+        <w:t xml:space="preserve"> 2026). Line chart </w:t>
+      </w:r>
+      <w:proofErr w:type="spellStart"/>
+      <w:r>
+        <w:rPr>
+          <w:rFonts w:ascii="Times New Roman" w:hAnsi="Times New Roman" w:cs="Times New Roman"/>
+          <w:color w:val="222222"/>
+          <w:sz w:val="24"/>
+          <w:szCs w:val="24"/>
+        </w:rPr>
+        <w:t>mendukung</w:t>
+      </w:r>
+      <w:proofErr w:type="spellEnd"/>
+      <w:r>
+        <w:rPr>
+          <w:rFonts w:ascii="Times New Roman" w:hAnsi="Times New Roman" w:cs="Times New Roman"/>
+          <w:color w:val="222222"/>
+          <w:sz w:val="24"/>
+          <w:szCs w:val="24"/>
+        </w:rPr>
+        <w:t xml:space="preserve"> drill-down </w:t>
       </w:r>
       <w:proofErr w:type="spellStart"/>
       <w:r>
@@ -6133,67 +6249,7 @@
           <w:sz w:val="24"/>
           <w:szCs w:val="24"/>
         </w:rPr>
-        <w:t xml:space="preserve"> pada </w:t>
-      </w:r>
-      <w:proofErr w:type="spellStart"/>
-      <w:r>
-        <w:rPr>
-          <w:rFonts w:ascii="Times New Roman" w:hAnsi="Times New Roman" w:cs="Times New Roman"/>
-          <w:color w:val="222222"/>
-          <w:sz w:val="24"/>
-          <w:szCs w:val="24"/>
-        </w:rPr>
-        <w:t>tren</w:t>
-      </w:r>
-      <w:proofErr w:type="spellEnd"/>
-      <w:r>
-        <w:rPr>
-          <w:rFonts w:ascii="Times New Roman" w:hAnsi="Times New Roman" w:cs="Times New Roman"/>
-          <w:color w:val="222222"/>
-          <w:sz w:val="24"/>
-          <w:szCs w:val="24"/>
-        </w:rPr>
-        <w:t xml:space="preserve"> (drill-down </w:t>
-      </w:r>
-      <w:proofErr w:type="spellStart"/>
-      <w:r>
-        <w:rPr>
-          <w:rFonts w:ascii="Times New Roman" w:hAnsi="Times New Roman" w:cs="Times New Roman"/>
-          <w:color w:val="222222"/>
-          <w:sz w:val="24"/>
-          <w:szCs w:val="24"/>
-        </w:rPr>
-        <w:t>bulan</w:t>
-      </w:r>
-      <w:proofErr w:type="spellEnd"/>
-      <w:r>
-        <w:rPr>
-          <w:rFonts w:ascii="Times New Roman" w:hAnsi="Times New Roman" w:cs="Times New Roman"/>
-          <w:color w:val="222222"/>
-          <w:sz w:val="24"/>
-          <w:szCs w:val="24"/>
-        </w:rPr>
-        <w:t>/</w:t>
-      </w:r>
-      <w:proofErr w:type="spellStart"/>
-      <w:r>
-        <w:rPr>
-          <w:rFonts w:ascii="Times New Roman" w:hAnsi="Times New Roman" w:cs="Times New Roman"/>
-          <w:color w:val="222222"/>
-          <w:sz w:val="24"/>
-          <w:szCs w:val="24"/>
-        </w:rPr>
-        <w:t>hari</w:t>
-      </w:r>
-      <w:proofErr w:type="spellEnd"/>
-      <w:r>
-        <w:rPr>
-          <w:rFonts w:ascii="Times New Roman" w:hAnsi="Times New Roman" w:cs="Times New Roman"/>
-          <w:color w:val="222222"/>
-          <w:sz w:val="24"/>
-          <w:szCs w:val="24"/>
-        </w:rPr>
-        <w:t>).</w:t>
+        <w:t>.</w:t>
       </w:r>
     </w:p>
     <w:p>
@@ -6294,7 +6350,27 @@
           <w:sz w:val="24"/>
           <w:szCs w:val="24"/>
         </w:rPr>
-        <w:t xml:space="preserve">. KPI </w:t>
+        <w:t xml:space="preserve">. Tiga KPI di </w:t>
+      </w:r>
+      <w:proofErr w:type="spellStart"/>
+      <w:r>
+        <w:rPr>
+          <w:rFonts w:ascii="Times New Roman" w:hAnsi="Times New Roman" w:cs="Times New Roman"/>
+          <w:color w:val="222222"/>
+          <w:sz w:val="24"/>
+          <w:szCs w:val="24"/>
+        </w:rPr>
+        <w:t>atas</w:t>
+      </w:r>
+      <w:proofErr w:type="spellEnd"/>
+      <w:r>
+        <w:rPr>
+          <w:rFonts w:ascii="Times New Roman" w:hAnsi="Times New Roman" w:cs="Times New Roman"/>
+          <w:color w:val="222222"/>
+          <w:sz w:val="24"/>
+          <w:szCs w:val="24"/>
+        </w:rPr>
+        <w:t xml:space="preserve">: </w:t>
       </w:r>
       <w:proofErr w:type="spellStart"/>
       <w:r>
@@ -6354,46 +6430,6 @@
           <w:sz w:val="24"/>
           <w:szCs w:val="24"/>
         </w:rPr>
-        <w:t xml:space="preserve"> </w:t>
-      </w:r>
-      <w:proofErr w:type="spellStart"/>
-      <w:r>
-        <w:rPr>
-          <w:rFonts w:ascii="Times New Roman" w:hAnsi="Times New Roman" w:cs="Times New Roman"/>
-          <w:color w:val="222222"/>
-          <w:sz w:val="24"/>
-          <w:szCs w:val="24"/>
-        </w:rPr>
-        <w:t>berada</w:t>
-      </w:r>
-      <w:proofErr w:type="spellEnd"/>
-      <w:r>
-        <w:rPr>
-          <w:rFonts w:ascii="Times New Roman" w:hAnsi="Times New Roman" w:cs="Times New Roman"/>
-          <w:color w:val="222222"/>
-          <w:sz w:val="24"/>
-          <w:szCs w:val="24"/>
-        </w:rPr>
-        <w:t xml:space="preserve"> di </w:t>
-      </w:r>
-      <w:proofErr w:type="spellStart"/>
-      <w:r>
-        <w:rPr>
-          <w:rFonts w:ascii="Times New Roman" w:hAnsi="Times New Roman" w:cs="Times New Roman"/>
-          <w:color w:val="222222"/>
-          <w:sz w:val="24"/>
-          <w:szCs w:val="24"/>
-        </w:rPr>
-        <w:t>atas</w:t>
-      </w:r>
-      <w:proofErr w:type="spellEnd"/>
-      <w:r>
-        <w:rPr>
-          <w:rFonts w:ascii="Times New Roman" w:hAnsi="Times New Roman" w:cs="Times New Roman"/>
-          <w:color w:val="222222"/>
-          <w:sz w:val="24"/>
-          <w:szCs w:val="24"/>
-        </w:rPr>
         <w:t xml:space="preserve">. Line chart </w:t>
       </w:r>
       <w:proofErr w:type="spellStart"/>
@@ -6474,7 +6510,107 @@
           <w:sz w:val="24"/>
           <w:szCs w:val="24"/>
         </w:rPr>
-        <w:t xml:space="preserve"> dan wilayah. Total </w:t>
+        <w:t xml:space="preserve"> dan wilayah (</w:t>
+      </w:r>
+      <w:proofErr w:type="spellStart"/>
+      <w:r>
+        <w:rPr>
+          <w:rFonts w:ascii="Times New Roman" w:hAnsi="Times New Roman" w:cs="Times New Roman"/>
+          <w:color w:val="222222"/>
+          <w:sz w:val="24"/>
+          <w:szCs w:val="24"/>
+        </w:rPr>
+        <w:t>satu</w:t>
+      </w:r>
+      <w:proofErr w:type="spellEnd"/>
+      <w:r>
+        <w:rPr>
+          <w:rFonts w:ascii="Times New Roman" w:hAnsi="Times New Roman" w:cs="Times New Roman"/>
+          <w:color w:val="222222"/>
+          <w:sz w:val="24"/>
+          <w:szCs w:val="24"/>
+        </w:rPr>
+        <w:t xml:space="preserve"> </w:t>
+      </w:r>
+      <w:proofErr w:type="spellStart"/>
+      <w:r>
+        <w:rPr>
+          <w:rFonts w:ascii="Times New Roman" w:hAnsi="Times New Roman" w:cs="Times New Roman"/>
+          <w:color w:val="222222"/>
+          <w:sz w:val="24"/>
+          <w:szCs w:val="24"/>
+        </w:rPr>
+        <w:t>warna</w:t>
+      </w:r>
+      <w:proofErr w:type="spellEnd"/>
+      <w:r>
+        <w:rPr>
+          <w:rFonts w:ascii="Times New Roman" w:hAnsi="Times New Roman" w:cs="Times New Roman"/>
+          <w:color w:val="222222"/>
+          <w:sz w:val="24"/>
+          <w:szCs w:val="24"/>
+        </w:rPr>
+        <w:t xml:space="preserve">, </w:t>
+      </w:r>
+      <w:proofErr w:type="spellStart"/>
+      <w:r>
+        <w:rPr>
+          <w:rFonts w:ascii="Times New Roman" w:hAnsi="Times New Roman" w:cs="Times New Roman"/>
+          <w:color w:val="222222"/>
+          <w:sz w:val="24"/>
+          <w:szCs w:val="24"/>
+        </w:rPr>
+        <w:t>makna</w:t>
+      </w:r>
+      <w:proofErr w:type="spellEnd"/>
+      <w:r>
+        <w:rPr>
+          <w:rFonts w:ascii="Times New Roman" w:hAnsi="Times New Roman" w:cs="Times New Roman"/>
+          <w:color w:val="222222"/>
+          <w:sz w:val="24"/>
+          <w:szCs w:val="24"/>
+        </w:rPr>
+        <w:t xml:space="preserve"> pada </w:t>
+      </w:r>
+      <w:proofErr w:type="spellStart"/>
+      <w:r>
+        <w:rPr>
+          <w:rFonts w:ascii="Times New Roman" w:hAnsi="Times New Roman" w:cs="Times New Roman"/>
+          <w:color w:val="222222"/>
+          <w:sz w:val="24"/>
+          <w:szCs w:val="24"/>
+        </w:rPr>
+        <w:t>panjang</w:t>
+      </w:r>
+      <w:proofErr w:type="spellEnd"/>
+      <w:r>
+        <w:rPr>
+          <w:rFonts w:ascii="Times New Roman" w:hAnsi="Times New Roman" w:cs="Times New Roman"/>
+          <w:color w:val="222222"/>
+          <w:sz w:val="24"/>
+          <w:szCs w:val="24"/>
+        </w:rPr>
+        <w:t xml:space="preserve"> </w:t>
+      </w:r>
+      <w:proofErr w:type="spellStart"/>
+      <w:r>
+        <w:rPr>
+          <w:rFonts w:ascii="Times New Roman" w:hAnsi="Times New Roman" w:cs="Times New Roman"/>
+          <w:color w:val="222222"/>
+          <w:sz w:val="24"/>
+          <w:szCs w:val="24"/>
+        </w:rPr>
+        <w:t>batang</w:t>
+      </w:r>
+      <w:proofErr w:type="spellEnd"/>
+      <w:r>
+        <w:rPr>
+          <w:rFonts w:ascii="Times New Roman" w:hAnsi="Times New Roman" w:cs="Times New Roman"/>
+          <w:color w:val="222222"/>
+          <w:sz w:val="24"/>
+          <w:szCs w:val="24"/>
+        </w:rPr>
+        <w:t xml:space="preserve">). Total </w:t>
       </w:r>
       <w:proofErr w:type="spellStart"/>
       <w:r>
@@ -6554,47 +6690,67 @@
           <w:sz w:val="24"/>
           <w:szCs w:val="24"/>
         </w:rPr>
-        <w:t xml:space="preserve"> dan 1.320 order. Pada screenshot final, slicer Year = 2025 </w:t>
-      </w:r>
-      <w:proofErr w:type="spellStart"/>
-      <w:r>
-        <w:rPr>
-          <w:rFonts w:ascii="Times New Roman" w:hAnsi="Times New Roman" w:cs="Times New Roman"/>
-          <w:color w:val="222222"/>
-          <w:sz w:val="24"/>
-          <w:szCs w:val="24"/>
-        </w:rPr>
-        <w:t>sehingga</w:t>
-      </w:r>
-      <w:proofErr w:type="spellEnd"/>
-      <w:r>
-        <w:rPr>
-          <w:rFonts w:ascii="Times New Roman" w:hAnsi="Times New Roman" w:cs="Times New Roman"/>
-          <w:color w:val="222222"/>
-          <w:sz w:val="24"/>
-          <w:szCs w:val="24"/>
-        </w:rPr>
-        <w:t xml:space="preserve"> KPI Overview </w:t>
-      </w:r>
-      <w:proofErr w:type="spellStart"/>
-      <w:r>
-        <w:rPr>
-          <w:rFonts w:ascii="Times New Roman" w:hAnsi="Times New Roman" w:cs="Times New Roman"/>
-          <w:color w:val="222222"/>
-          <w:sz w:val="24"/>
-          <w:szCs w:val="24"/>
-        </w:rPr>
-        <w:t>menjadi</w:t>
-      </w:r>
-      <w:proofErr w:type="spellEnd"/>
-      <w:r>
-        <w:rPr>
-          <w:rFonts w:ascii="Times New Roman" w:hAnsi="Times New Roman" w:cs="Times New Roman"/>
-          <w:color w:val="222222"/>
-          <w:sz w:val="24"/>
-          <w:szCs w:val="24"/>
-        </w:rPr>
-        <w:t xml:space="preserve"> 1,84 </w:t>
+        <w:t xml:space="preserve"> dan 1.320 order. Pada screenshot Overview, </w:t>
+      </w:r>
+      <w:proofErr w:type="spellStart"/>
+      <w:r>
+        <w:rPr>
+          <w:rFonts w:ascii="Times New Roman" w:hAnsi="Times New Roman" w:cs="Times New Roman"/>
+          <w:color w:val="222222"/>
+          <w:sz w:val="24"/>
+          <w:szCs w:val="24"/>
+        </w:rPr>
+        <w:t>tren</w:t>
+      </w:r>
+      <w:proofErr w:type="spellEnd"/>
+      <w:r>
+        <w:rPr>
+          <w:rFonts w:ascii="Times New Roman" w:hAnsi="Times New Roman" w:cs="Times New Roman"/>
+          <w:color w:val="222222"/>
+          <w:sz w:val="24"/>
+          <w:szCs w:val="24"/>
+        </w:rPr>
+        <w:t xml:space="preserve"> dan KPI </w:t>
+      </w:r>
+      <w:proofErr w:type="spellStart"/>
+      <w:r>
+        <w:rPr>
+          <w:rFonts w:ascii="Times New Roman" w:hAnsi="Times New Roman" w:cs="Times New Roman"/>
+          <w:color w:val="222222"/>
+          <w:sz w:val="24"/>
+          <w:szCs w:val="24"/>
+        </w:rPr>
+        <w:t>menampilkan</w:t>
+      </w:r>
+      <w:proofErr w:type="spellEnd"/>
+      <w:r>
+        <w:rPr>
+          <w:rFonts w:ascii="Times New Roman" w:hAnsi="Times New Roman" w:cs="Times New Roman"/>
+          <w:color w:val="222222"/>
+          <w:sz w:val="24"/>
+          <w:szCs w:val="24"/>
+        </w:rPr>
+        <w:t xml:space="preserve"> </w:t>
+      </w:r>
+      <w:proofErr w:type="spellStart"/>
+      <w:r>
+        <w:rPr>
+          <w:rFonts w:ascii="Times New Roman" w:hAnsi="Times New Roman" w:cs="Times New Roman"/>
+          <w:color w:val="222222"/>
+          <w:sz w:val="24"/>
+          <w:szCs w:val="24"/>
+        </w:rPr>
+        <w:t>cuplikan</w:t>
+      </w:r>
+      <w:proofErr w:type="spellEnd"/>
+      <w:r>
+        <w:rPr>
+          <w:rFonts w:ascii="Times New Roman" w:hAnsi="Times New Roman" w:cs="Times New Roman"/>
+          <w:color w:val="222222"/>
+          <w:sz w:val="24"/>
+          <w:szCs w:val="24"/>
+        </w:rPr>
+        <w:t xml:space="preserve"> 2025 (1,84 </w:t>
       </w:r>
       <w:proofErr w:type="spellStart"/>
       <w:r>
@@ -6654,17 +6810,157 @@
           <w:sz w:val="24"/>
           <w:szCs w:val="24"/>
         </w:rPr>
-        <w:t xml:space="preserve"> — </w:t>
-      </w:r>
-      <w:proofErr w:type="spellStart"/>
-      <w:r>
-        <w:rPr>
-          <w:rFonts w:ascii="Times New Roman" w:hAnsi="Times New Roman" w:cs="Times New Roman"/>
-          <w:color w:val="222222"/>
-          <w:sz w:val="24"/>
-          <w:szCs w:val="24"/>
-        </w:rPr>
-        <w:t>bukti</w:t>
+        <w:t xml:space="preserve">), </w:t>
+      </w:r>
+      <w:proofErr w:type="spellStart"/>
+      <w:r>
+        <w:rPr>
+          <w:rFonts w:ascii="Times New Roman" w:hAnsi="Times New Roman" w:cs="Times New Roman"/>
+          <w:color w:val="222222"/>
+          <w:sz w:val="24"/>
+          <w:szCs w:val="24"/>
+        </w:rPr>
+        <w:t>sementara</w:t>
+      </w:r>
+      <w:proofErr w:type="spellEnd"/>
+      <w:r>
+        <w:rPr>
+          <w:rFonts w:ascii="Times New Roman" w:hAnsi="Times New Roman" w:cs="Times New Roman"/>
+          <w:color w:val="222222"/>
+          <w:sz w:val="24"/>
+          <w:szCs w:val="24"/>
+        </w:rPr>
+        <w:t xml:space="preserve"> </w:t>
+      </w:r>
+      <w:proofErr w:type="spellStart"/>
+      <w:r>
+        <w:rPr>
+          <w:rFonts w:ascii="Times New Roman" w:hAnsi="Times New Roman" w:cs="Times New Roman"/>
+          <w:color w:val="222222"/>
+          <w:sz w:val="24"/>
+          <w:szCs w:val="24"/>
+        </w:rPr>
+        <w:t>halaman</w:t>
+      </w:r>
+      <w:proofErr w:type="spellEnd"/>
+      <w:r>
+        <w:rPr>
+          <w:rFonts w:ascii="Times New Roman" w:hAnsi="Times New Roman" w:cs="Times New Roman"/>
+          <w:color w:val="222222"/>
+          <w:sz w:val="24"/>
+          <w:szCs w:val="24"/>
+        </w:rPr>
+        <w:t xml:space="preserve"> 2 </w:t>
+      </w:r>
+      <w:proofErr w:type="spellStart"/>
+      <w:r>
+        <w:rPr>
+          <w:rFonts w:ascii="Times New Roman" w:hAnsi="Times New Roman" w:cs="Times New Roman"/>
+          <w:color w:val="222222"/>
+          <w:sz w:val="24"/>
+          <w:szCs w:val="24"/>
+        </w:rPr>
+        <w:t>menampilkan</w:t>
+      </w:r>
+      <w:proofErr w:type="spellEnd"/>
+      <w:r>
+        <w:rPr>
+          <w:rFonts w:ascii="Times New Roman" w:hAnsi="Times New Roman" w:cs="Times New Roman"/>
+          <w:color w:val="222222"/>
+          <w:sz w:val="24"/>
+          <w:szCs w:val="24"/>
+        </w:rPr>
+        <w:t xml:space="preserve"> total </w:t>
+      </w:r>
+      <w:proofErr w:type="spellStart"/>
+      <w:r>
+        <w:rPr>
+          <w:rFonts w:ascii="Times New Roman" w:hAnsi="Times New Roman" w:cs="Times New Roman"/>
+          <w:color w:val="222222"/>
+          <w:sz w:val="24"/>
+          <w:szCs w:val="24"/>
+        </w:rPr>
+        <w:t>penuh</w:t>
+      </w:r>
+      <w:proofErr w:type="spellEnd"/>
+      <w:r>
+        <w:rPr>
+          <w:rFonts w:ascii="Times New Roman" w:hAnsi="Times New Roman" w:cs="Times New Roman"/>
+          <w:color w:val="222222"/>
+          <w:sz w:val="24"/>
+          <w:szCs w:val="24"/>
+        </w:rPr>
+        <w:t xml:space="preserve"> 3,65 </w:t>
+      </w:r>
+      <w:proofErr w:type="spellStart"/>
+      <w:r>
+        <w:rPr>
+          <w:rFonts w:ascii="Times New Roman" w:hAnsi="Times New Roman" w:cs="Times New Roman"/>
+          <w:color w:val="222222"/>
+          <w:sz w:val="24"/>
+          <w:szCs w:val="24"/>
+        </w:rPr>
+        <w:t>juta</w:t>
+      </w:r>
+      <w:proofErr w:type="spellEnd"/>
+      <w:r>
+        <w:rPr>
+          <w:rFonts w:ascii="Times New Roman" w:hAnsi="Times New Roman" w:cs="Times New Roman"/>
+          <w:color w:val="222222"/>
+          <w:sz w:val="24"/>
+          <w:szCs w:val="24"/>
+        </w:rPr>
+        <w:t xml:space="preserve"> — dua </w:t>
+      </w:r>
+      <w:proofErr w:type="spellStart"/>
+      <w:r>
+        <w:rPr>
+          <w:rFonts w:ascii="Times New Roman" w:hAnsi="Times New Roman" w:cs="Times New Roman"/>
+          <w:color w:val="222222"/>
+          <w:sz w:val="24"/>
+          <w:szCs w:val="24"/>
+        </w:rPr>
+        <w:t>kondisi</w:t>
+      </w:r>
+      <w:proofErr w:type="spellEnd"/>
+      <w:r>
+        <w:rPr>
+          <w:rFonts w:ascii="Times New Roman" w:hAnsi="Times New Roman" w:cs="Times New Roman"/>
+          <w:color w:val="222222"/>
+          <w:sz w:val="24"/>
+          <w:szCs w:val="24"/>
+        </w:rPr>
+        <w:t xml:space="preserve"> </w:t>
+      </w:r>
+      <w:proofErr w:type="spellStart"/>
+      <w:r>
+        <w:rPr>
+          <w:rFonts w:ascii="Times New Roman" w:hAnsi="Times New Roman" w:cs="Times New Roman"/>
+          <w:color w:val="222222"/>
+          <w:sz w:val="24"/>
+          <w:szCs w:val="24"/>
+        </w:rPr>
+        <w:t>itu</w:t>
+      </w:r>
+      <w:proofErr w:type="spellEnd"/>
+      <w:r>
+        <w:rPr>
+          <w:rFonts w:ascii="Times New Roman" w:hAnsi="Times New Roman" w:cs="Times New Roman"/>
+          <w:color w:val="222222"/>
+          <w:sz w:val="24"/>
+          <w:szCs w:val="24"/>
+        </w:rPr>
+        <w:t xml:space="preserve"> </w:t>
+      </w:r>
+      <w:proofErr w:type="spellStart"/>
+      <w:r>
+        <w:rPr>
+          <w:rFonts w:ascii="Times New Roman" w:hAnsi="Times New Roman" w:cs="Times New Roman"/>
+          <w:color w:val="222222"/>
+          <w:sz w:val="24"/>
+          <w:szCs w:val="24"/>
+        </w:rPr>
+        <w:t>memperlihatkan</w:t>
       </w:r>
       <w:proofErr w:type="spellEnd"/>
       <w:r>
@@ -6684,7 +6980,47 @@
           <w:sz w:val="24"/>
           <w:szCs w:val="24"/>
         </w:rPr>
+        <w:t>halaman</w:t>
+      </w:r>
+      <w:proofErr w:type="spellEnd"/>
+      <w:r>
+        <w:rPr>
+          <w:rFonts w:ascii="Times New Roman" w:hAnsi="Times New Roman" w:cs="Times New Roman"/>
+          <w:color w:val="222222"/>
+          <w:sz w:val="24"/>
+          <w:szCs w:val="24"/>
+        </w:rPr>
+        <w:t xml:space="preserve"> </w:t>
+      </w:r>
+      <w:proofErr w:type="spellStart"/>
+      <w:r>
+        <w:rPr>
+          <w:rFonts w:ascii="Times New Roman" w:hAnsi="Times New Roman" w:cs="Times New Roman"/>
+          <w:color w:val="222222"/>
+          <w:sz w:val="24"/>
+          <w:szCs w:val="24"/>
+        </w:rPr>
         <w:t>bekerja</w:t>
+      </w:r>
+      <w:proofErr w:type="spellEnd"/>
+      <w:r>
+        <w:rPr>
+          <w:rFonts w:ascii="Times New Roman" w:hAnsi="Times New Roman" w:cs="Times New Roman"/>
+          <w:color w:val="222222"/>
+          <w:sz w:val="24"/>
+          <w:szCs w:val="24"/>
+        </w:rPr>
+        <w:t xml:space="preserve"> </w:t>
+      </w:r>
+      <w:proofErr w:type="spellStart"/>
+      <w:r>
+        <w:rPr>
+          <w:rFonts w:ascii="Times New Roman" w:hAnsi="Times New Roman" w:cs="Times New Roman"/>
+          <w:color w:val="222222"/>
+          <w:sz w:val="24"/>
+          <w:szCs w:val="24"/>
+        </w:rPr>
+        <w:t>mandiri</w:t>
       </w:r>
       <w:proofErr w:type="spellEnd"/>
       <w:r>
@@ -6712,7 +7048,7 @@
         </w:rPr>
         <w:lastRenderedPageBreak/>
         <w:drawing>
-          <wp:inline distT="0" distB="0" distL="0" distR="0" wp14:anchorId="3DFF12E1" wp14:editId="7D8421CB">
+          <wp:inline distT="0" distB="0" distL="0" distR="0" wp14:anchorId="46192A4A" wp14:editId="4E782396">
             <wp:extent cx="4762500" cy="2714625"/>
             <wp:effectExtent l="0" t="0" r="0" b="0"/>
             <wp:docPr id="4" name="Picture 4"/>
@@ -6768,7 +7104,7 @@
           <w:sz w:val="17"/>
           <w:szCs w:val="17"/>
         </w:rPr>
-        <w:t xml:space="preserve">Gambar 4. Halaman Overview (filter 2025): KPI, </w:t>
+        <w:t xml:space="preserve">Gambar 4. Halaman Overview: tile </w:t>
       </w:r>
       <w:proofErr w:type="spellStart"/>
       <w:r>
@@ -6780,7 +7116,7 @@
           <w:sz w:val="17"/>
           <w:szCs w:val="17"/>
         </w:rPr>
-        <w:t>tren</w:t>
+        <w:t>kategori</w:t>
       </w:r>
       <w:proofErr w:type="spellEnd"/>
       <w:r>
@@ -6792,7 +7128,7 @@
           <w:sz w:val="17"/>
           <w:szCs w:val="17"/>
         </w:rPr>
-        <w:t xml:space="preserve"> </w:t>
+        <w:t xml:space="preserve"> (</w:t>
       </w:r>
       <w:proofErr w:type="spellStart"/>
       <w:r>
@@ -6804,7 +7140,7 @@
           <w:sz w:val="17"/>
           <w:szCs w:val="17"/>
         </w:rPr>
-        <w:t>penjualan</w:t>
+        <w:t>termasuk</w:t>
       </w:r>
       <w:proofErr w:type="spellEnd"/>
       <w:r>
@@ -6816,7 +7152,7 @@
           <w:sz w:val="17"/>
           <w:szCs w:val="17"/>
         </w:rPr>
-        <w:t xml:space="preserve">, ranking </w:t>
+        <w:t xml:space="preserve"> Home), dropdown wilayah, slicer </w:t>
       </w:r>
       <w:proofErr w:type="spellStart"/>
       <w:r>
@@ -6828,7 +7164,7 @@
           <w:sz w:val="17"/>
           <w:szCs w:val="17"/>
         </w:rPr>
-        <w:t>kategori</w:t>
+        <w:t>tanggal</w:t>
       </w:r>
       <w:proofErr w:type="spellEnd"/>
       <w:r>
@@ -6840,7 +7176,31 @@
           <w:sz w:val="17"/>
           <w:szCs w:val="17"/>
         </w:rPr>
-        <w:t>, dan ranking wilayah.</w:t>
+        <w:t xml:space="preserve">, KPI, </w:t>
+      </w:r>
+      <w:proofErr w:type="spellStart"/>
+      <w:r>
+        <w:rPr>
+          <w:rFonts w:ascii="Times New Roman" w:hAnsi="Times New Roman" w:cs="Times New Roman"/>
+          <w:i/>
+          <w:iCs/>
+          <w:color w:val="5B6770"/>
+          <w:sz w:val="17"/>
+          <w:szCs w:val="17"/>
+        </w:rPr>
+        <w:t>tren</w:t>
+      </w:r>
+      <w:proofErr w:type="spellEnd"/>
+      <w:r>
+        <w:rPr>
+          <w:rFonts w:ascii="Times New Roman" w:hAnsi="Times New Roman" w:cs="Times New Roman"/>
+          <w:i/>
+          <w:iCs/>
+          <w:color w:val="5B6770"/>
+          <w:sz w:val="17"/>
+          <w:szCs w:val="17"/>
+        </w:rPr>
+        <w:t>, dan ranking.</w:t>
       </w:r>
     </w:p>
     <w:p>
@@ -7041,147 +7401,7 @@
           <w:sz w:val="24"/>
           <w:szCs w:val="24"/>
         </w:rPr>
-        <w:t xml:space="preserve"> ranking (</w:t>
-      </w:r>
-      <w:proofErr w:type="spellStart"/>
-      <w:r>
-        <w:rPr>
-          <w:rFonts w:ascii="Times New Roman" w:hAnsi="Times New Roman" w:cs="Times New Roman"/>
-          <w:color w:val="222222"/>
-          <w:sz w:val="24"/>
-          <w:szCs w:val="24"/>
-        </w:rPr>
-        <w:t>panjang</w:t>
-      </w:r>
-      <w:proofErr w:type="spellEnd"/>
-      <w:r>
-        <w:rPr>
-          <w:rFonts w:ascii="Times New Roman" w:hAnsi="Times New Roman" w:cs="Times New Roman"/>
-          <w:color w:val="222222"/>
-          <w:sz w:val="24"/>
-          <w:szCs w:val="24"/>
-        </w:rPr>
-        <w:t xml:space="preserve"> </w:t>
-      </w:r>
-      <w:proofErr w:type="spellStart"/>
-      <w:r>
-        <w:rPr>
-          <w:rFonts w:ascii="Times New Roman" w:hAnsi="Times New Roman" w:cs="Times New Roman"/>
-          <w:color w:val="222222"/>
-          <w:sz w:val="24"/>
-          <w:szCs w:val="24"/>
-        </w:rPr>
-        <w:t>batang</w:t>
-      </w:r>
-      <w:proofErr w:type="spellEnd"/>
-      <w:r>
-        <w:rPr>
-          <w:rFonts w:ascii="Times New Roman" w:hAnsi="Times New Roman" w:cs="Times New Roman"/>
-          <w:color w:val="222222"/>
-          <w:sz w:val="24"/>
-          <w:szCs w:val="24"/>
-        </w:rPr>
-        <w:t xml:space="preserve"> = </w:t>
-      </w:r>
-      <w:proofErr w:type="spellStart"/>
-      <w:r>
-        <w:rPr>
-          <w:rFonts w:ascii="Times New Roman" w:hAnsi="Times New Roman" w:cs="Times New Roman"/>
-          <w:color w:val="222222"/>
-          <w:sz w:val="24"/>
-          <w:szCs w:val="24"/>
-        </w:rPr>
-        <w:t>makna</w:t>
-      </w:r>
-      <w:proofErr w:type="spellEnd"/>
-      <w:r>
-        <w:rPr>
-          <w:rFonts w:ascii="Times New Roman" w:hAnsi="Times New Roman" w:cs="Times New Roman"/>
-          <w:color w:val="222222"/>
-          <w:sz w:val="24"/>
-          <w:szCs w:val="24"/>
-        </w:rPr>
-        <w:t xml:space="preserve">; </w:t>
-      </w:r>
-      <w:proofErr w:type="spellStart"/>
-      <w:r>
-        <w:rPr>
-          <w:rFonts w:ascii="Times New Roman" w:hAnsi="Times New Roman" w:cs="Times New Roman"/>
-          <w:color w:val="222222"/>
-          <w:sz w:val="24"/>
-          <w:szCs w:val="24"/>
-        </w:rPr>
-        <w:t>satu</w:t>
-      </w:r>
-      <w:proofErr w:type="spellEnd"/>
-      <w:r>
-        <w:rPr>
-          <w:rFonts w:ascii="Times New Roman" w:hAnsi="Times New Roman" w:cs="Times New Roman"/>
-          <w:color w:val="222222"/>
-          <w:sz w:val="24"/>
-          <w:szCs w:val="24"/>
-        </w:rPr>
-        <w:t xml:space="preserve"> </w:t>
-      </w:r>
-      <w:proofErr w:type="spellStart"/>
-      <w:r>
-        <w:rPr>
-          <w:rFonts w:ascii="Times New Roman" w:hAnsi="Times New Roman" w:cs="Times New Roman"/>
-          <w:color w:val="222222"/>
-          <w:sz w:val="24"/>
-          <w:szCs w:val="24"/>
-        </w:rPr>
-        <w:t>warna</w:t>
-      </w:r>
-      <w:proofErr w:type="spellEnd"/>
-      <w:r>
-        <w:rPr>
-          <w:rFonts w:ascii="Times New Roman" w:hAnsi="Times New Roman" w:cs="Times New Roman"/>
-          <w:color w:val="222222"/>
-          <w:sz w:val="24"/>
-          <w:szCs w:val="24"/>
-        </w:rPr>
-        <w:t xml:space="preserve"> agar </w:t>
-      </w:r>
-      <w:proofErr w:type="spellStart"/>
-      <w:r>
-        <w:rPr>
-          <w:rFonts w:ascii="Times New Roman" w:hAnsi="Times New Roman" w:cs="Times New Roman"/>
-          <w:color w:val="222222"/>
-          <w:sz w:val="24"/>
-          <w:szCs w:val="24"/>
-        </w:rPr>
-        <w:t>bukan</w:t>
-      </w:r>
-      <w:proofErr w:type="spellEnd"/>
-      <w:r>
-        <w:rPr>
-          <w:rFonts w:ascii="Times New Roman" w:hAnsi="Times New Roman" w:cs="Times New Roman"/>
-          <w:color w:val="222222"/>
-          <w:sz w:val="24"/>
-          <w:szCs w:val="24"/>
-        </w:rPr>
-        <w:t xml:space="preserve"> </w:t>
-      </w:r>
-      <w:proofErr w:type="spellStart"/>
-      <w:r>
-        <w:rPr>
-          <w:rFonts w:ascii="Times New Roman" w:hAnsi="Times New Roman" w:cs="Times New Roman"/>
-          <w:color w:val="222222"/>
-          <w:sz w:val="24"/>
-          <w:szCs w:val="24"/>
-        </w:rPr>
-        <w:t>hiasan</w:t>
-      </w:r>
-      <w:proofErr w:type="spellEnd"/>
-      <w:r>
-        <w:rPr>
-          <w:rFonts w:ascii="Times New Roman" w:hAnsi="Times New Roman" w:cs="Times New Roman"/>
-          <w:color w:val="222222"/>
-          <w:sz w:val="24"/>
-          <w:szCs w:val="24"/>
-        </w:rPr>
-        <w:t xml:space="preserve">). Halaman 2 </w:t>
+        <w:t xml:space="preserve"> ranking. Halaman 2 </w:t>
       </w:r>
       <w:proofErr w:type="spellStart"/>
       <w:r>
@@ -7551,26 +7771,6 @@
           <w:sz w:val="24"/>
           <w:szCs w:val="24"/>
         </w:rPr>
-        <w:t>sudah</w:t>
-      </w:r>
-      <w:proofErr w:type="spellEnd"/>
-      <w:r>
-        <w:rPr>
-          <w:rFonts w:ascii="Times New Roman" w:hAnsi="Times New Roman" w:cs="Times New Roman"/>
-          <w:color w:val="222222"/>
-          <w:sz w:val="24"/>
-          <w:szCs w:val="24"/>
-        </w:rPr>
-        <w:t xml:space="preserve"> </w:t>
-      </w:r>
-      <w:proofErr w:type="spellStart"/>
-      <w:r>
-        <w:rPr>
-          <w:rFonts w:ascii="Times New Roman" w:hAnsi="Times New Roman" w:cs="Times New Roman"/>
-          <w:color w:val="222222"/>
-          <w:sz w:val="24"/>
-          <w:szCs w:val="24"/>
-        </w:rPr>
         <w:t>diurutkan</w:t>
       </w:r>
       <w:proofErr w:type="spellEnd"/>
@@ -7711,27 +7911,27 @@
           <w:sz w:val="24"/>
           <w:szCs w:val="24"/>
         </w:rPr>
+        <w:t>tanggal</w:t>
+      </w:r>
+      <w:proofErr w:type="spellEnd"/>
+      <w:r>
+        <w:rPr>
+          <w:rFonts w:ascii="Times New Roman" w:hAnsi="Times New Roman" w:cs="Times New Roman"/>
+          <w:color w:val="222222"/>
+          <w:sz w:val="24"/>
+          <w:szCs w:val="24"/>
+        </w:rPr>
+        <w:t xml:space="preserve"> dan </w:t>
+      </w:r>
+      <w:proofErr w:type="spellStart"/>
+      <w:r>
+        <w:rPr>
+          <w:rFonts w:ascii="Times New Roman" w:hAnsi="Times New Roman" w:cs="Times New Roman"/>
+          <w:color w:val="222222"/>
+          <w:sz w:val="24"/>
+          <w:szCs w:val="24"/>
+        </w:rPr>
         <w:t>kategori</w:t>
-      </w:r>
-      <w:proofErr w:type="spellEnd"/>
-      <w:r>
-        <w:rPr>
-          <w:rFonts w:ascii="Times New Roman" w:hAnsi="Times New Roman" w:cs="Times New Roman"/>
-          <w:color w:val="222222"/>
-          <w:sz w:val="24"/>
-          <w:szCs w:val="24"/>
-        </w:rPr>
-        <w:t xml:space="preserve"> dan </w:t>
-      </w:r>
-      <w:proofErr w:type="spellStart"/>
-      <w:r>
-        <w:rPr>
-          <w:rFonts w:ascii="Times New Roman" w:hAnsi="Times New Roman" w:cs="Times New Roman"/>
-          <w:color w:val="222222"/>
-          <w:sz w:val="24"/>
-          <w:szCs w:val="24"/>
-        </w:rPr>
-        <w:t>tahun</w:t>
       </w:r>
       <w:proofErr w:type="spellEnd"/>
       <w:r>
@@ -7898,7 +8098,7 @@
           <w:noProof/>
         </w:rPr>
         <w:drawing>
-          <wp:inline distT="0" distB="0" distL="0" distR="0" wp14:anchorId="511163B4" wp14:editId="232ACD14">
+          <wp:inline distT="0" distB="0" distL="0" distR="0" wp14:anchorId="71FA0F00" wp14:editId="211E6737">
             <wp:extent cx="4762500" cy="2714625"/>
             <wp:effectExtent l="0" t="0" r="0" b="0"/>
             <wp:docPr id="5" name="Picture 5"/>
@@ -7954,7 +8154,7 @@
           <w:sz w:val="17"/>
           <w:szCs w:val="17"/>
         </w:rPr>
-        <w:t xml:space="preserve">Gambar 5. Halaman Breakdown Wilayah: KPI total 3,65 </w:t>
+        <w:t xml:space="preserve">Gambar 5. Halaman Breakdown Wilayah: KPI 3,65 </w:t>
       </w:r>
       <w:proofErr w:type="spellStart"/>
       <w:r>
@@ -7991,6 +8191,30 @@
           <w:szCs w:val="17"/>
         </w:rPr>
         <w:t>tabel</w:t>
+      </w:r>
+      <w:proofErr w:type="spellEnd"/>
+      <w:r>
+        <w:rPr>
+          <w:rFonts w:ascii="Times New Roman" w:hAnsi="Times New Roman" w:cs="Times New Roman"/>
+          <w:i/>
+          <w:iCs/>
+          <w:color w:val="5B6770"/>
+          <w:sz w:val="17"/>
+          <w:szCs w:val="17"/>
+        </w:rPr>
+        <w:t xml:space="preserve"> </w:t>
+      </w:r>
+      <w:proofErr w:type="spellStart"/>
+      <w:r>
+        <w:rPr>
+          <w:rFonts w:ascii="Times New Roman" w:hAnsi="Times New Roman" w:cs="Times New Roman"/>
+          <w:i/>
+          <w:iCs/>
+          <w:color w:val="5B6770"/>
+          <w:sz w:val="17"/>
+          <w:szCs w:val="17"/>
+        </w:rPr>
+        <w:t>terurut</w:t>
       </w:r>
       <w:proofErr w:type="spellEnd"/>
       <w:r>
@@ -8519,7 +8743,7 @@
           <w:sz w:val="24"/>
           <w:szCs w:val="24"/>
         </w:rPr>
-        <w:t xml:space="preserve"> (Electronics, Fashion, Groceries, Home), </w:t>
+        <w:t xml:space="preserve">, </w:t>
       </w:r>
       <w:proofErr w:type="spellStart"/>
       <w:r>
@@ -8565,8 +8789,14 @@
     <w:p>
       <w:pPr>
         <w:pStyle w:val="Heading1"/>
+        <w:rPr>
+          <w:rFonts w:cs="Times New Roman"/>
+        </w:rPr>
       </w:pPr>
       <w:r>
+        <w:rPr>
+          <w:rFonts w:cs="Times New Roman"/>
+        </w:rPr>
         <w:t>E. Kendala &amp; Solusi</w:t>
       </w:r>
     </w:p>
@@ -8581,6 +8811,8 @@
         <w:jc w:val="both"/>
         <w:rPr>
           <w:rFonts w:ascii="Times New Roman" w:hAnsi="Times New Roman" w:cs="Times New Roman"/>
+          <w:sz w:val="24"/>
+          <w:szCs w:val="24"/>
         </w:rPr>
       </w:pPr>
       <w:proofErr w:type="spellStart"/>
@@ -8588,6 +8820,8 @@
         <w:rPr>
           <w:rFonts w:ascii="Times New Roman" w:hAnsi="Times New Roman" w:cs="Times New Roman"/>
           <w:color w:val="222222"/>
+          <w:sz w:val="24"/>
+          <w:szCs w:val="24"/>
         </w:rPr>
         <w:lastRenderedPageBreak/>
         <w:t>Aktivasi</w:t>
@@ -8597,6 +8831,8 @@
         <w:rPr>
           <w:rFonts w:ascii="Times New Roman" w:hAnsi="Times New Roman" w:cs="Times New Roman"/>
           <w:color w:val="222222"/>
+          <w:sz w:val="24"/>
+          <w:szCs w:val="24"/>
         </w:rPr>
         <w:t xml:space="preserve"> virtual environment di Windows </w:t>
       </w:r>
@@ -8605,6 +8841,8 @@
         <w:rPr>
           <w:rFonts w:ascii="Times New Roman" w:hAnsi="Times New Roman" w:cs="Times New Roman"/>
           <w:color w:val="222222"/>
+          <w:sz w:val="24"/>
+          <w:szCs w:val="24"/>
         </w:rPr>
         <w:t>membuka</w:t>
       </w:r>
@@ -8613,6 +8851,8 @@
         <w:rPr>
           <w:rFonts w:ascii="Times New Roman" w:hAnsi="Times New Roman" w:cs="Times New Roman"/>
           <w:color w:val="222222"/>
+          <w:sz w:val="24"/>
+          <w:szCs w:val="24"/>
         </w:rPr>
         <w:t xml:space="preserve"> Activate.ps1 </w:t>
       </w:r>
@@ -8621,6 +8861,8 @@
         <w:rPr>
           <w:rFonts w:ascii="Times New Roman" w:hAnsi="Times New Roman" w:cs="Times New Roman"/>
           <w:color w:val="222222"/>
+          <w:sz w:val="24"/>
+          <w:szCs w:val="24"/>
         </w:rPr>
         <w:t>sebagai</w:t>
       </w:r>
@@ -8629,14 +8871,18 @@
         <w:rPr>
           <w:rFonts w:ascii="Times New Roman" w:hAnsi="Times New Roman" w:cs="Times New Roman"/>
           <w:color w:val="222222"/>
-        </w:rPr>
-        <w:t xml:space="preserve"> </w:t>
-      </w:r>
-      <w:proofErr w:type="spellStart"/>
-      <w:r>
-        <w:rPr>
-          <w:rFonts w:ascii="Times New Roman" w:hAnsi="Times New Roman" w:cs="Times New Roman"/>
-          <w:color w:val="222222"/>
+          <w:sz w:val="24"/>
+          <w:szCs w:val="24"/>
+        </w:rPr>
+        <w:t xml:space="preserve"> </w:t>
+      </w:r>
+      <w:proofErr w:type="spellStart"/>
+      <w:r>
+        <w:rPr>
+          <w:rFonts w:ascii="Times New Roman" w:hAnsi="Times New Roman" w:cs="Times New Roman"/>
+          <w:color w:val="222222"/>
+          <w:sz w:val="24"/>
+          <w:szCs w:val="24"/>
         </w:rPr>
         <w:t>berkas</w:t>
       </w:r>
@@ -8645,14 +8891,18 @@
         <w:rPr>
           <w:rFonts w:ascii="Times New Roman" w:hAnsi="Times New Roman" w:cs="Times New Roman"/>
           <w:color w:val="222222"/>
-        </w:rPr>
-        <w:t xml:space="preserve"> </w:t>
-      </w:r>
-      <w:proofErr w:type="spellStart"/>
-      <w:r>
-        <w:rPr>
-          <w:rFonts w:ascii="Times New Roman" w:hAnsi="Times New Roman" w:cs="Times New Roman"/>
-          <w:color w:val="222222"/>
+          <w:sz w:val="24"/>
+          <w:szCs w:val="24"/>
+        </w:rPr>
+        <w:t xml:space="preserve"> </w:t>
+      </w:r>
+      <w:proofErr w:type="spellStart"/>
+      <w:r>
+        <w:rPr>
+          <w:rFonts w:ascii="Times New Roman" w:hAnsi="Times New Roman" w:cs="Times New Roman"/>
+          <w:color w:val="222222"/>
+          <w:sz w:val="24"/>
+          <w:szCs w:val="24"/>
         </w:rPr>
         <w:t>teks</w:t>
       </w:r>
@@ -8661,6 +8911,8 @@
         <w:rPr>
           <w:rFonts w:ascii="Times New Roman" w:hAnsi="Times New Roman" w:cs="Times New Roman"/>
           <w:color w:val="222222"/>
+          <w:sz w:val="24"/>
+          <w:szCs w:val="24"/>
         </w:rPr>
         <w:t xml:space="preserve">, dan </w:t>
       </w:r>
@@ -8669,6 +8921,8 @@
         <w:rPr>
           <w:rFonts w:ascii="Times New Roman" w:hAnsi="Times New Roman" w:cs="Times New Roman"/>
           <w:color w:val="222222"/>
+          <w:sz w:val="24"/>
+          <w:szCs w:val="24"/>
         </w:rPr>
         <w:t>sintaks</w:t>
       </w:r>
@@ -8677,6 +8931,8 @@
         <w:rPr>
           <w:rFonts w:ascii="Times New Roman" w:hAnsi="Times New Roman" w:cs="Times New Roman"/>
           <w:color w:val="222222"/>
+          <w:sz w:val="24"/>
+          <w:szCs w:val="24"/>
         </w:rPr>
         <w:t xml:space="preserve"> $</w:t>
       </w:r>
@@ -8686,6 +8942,8 @@
         <w:rPr>
           <w:rFonts w:ascii="Times New Roman" w:hAnsi="Times New Roman" w:cs="Times New Roman"/>
           <w:color w:val="222222"/>
+          <w:sz w:val="24"/>
+          <w:szCs w:val="24"/>
         </w:rPr>
         <w:t>env:DBT</w:t>
       </w:r>
@@ -8694,6 +8952,8 @@
         <w:rPr>
           <w:rFonts w:ascii="Times New Roman" w:hAnsi="Times New Roman" w:cs="Times New Roman"/>
           <w:color w:val="222222"/>
+          <w:sz w:val="24"/>
+          <w:szCs w:val="24"/>
         </w:rPr>
         <w:t>_PROFILES_DIR</w:t>
       </w:r>
@@ -8702,14 +8962,18 @@
         <w:rPr>
           <w:rFonts w:ascii="Times New Roman" w:hAnsi="Times New Roman" w:cs="Times New Roman"/>
           <w:color w:val="222222"/>
-        </w:rPr>
-        <w:t xml:space="preserve"> </w:t>
-      </w:r>
-      <w:proofErr w:type="spellStart"/>
-      <w:r>
-        <w:rPr>
-          <w:rFonts w:ascii="Times New Roman" w:hAnsi="Times New Roman" w:cs="Times New Roman"/>
-          <w:color w:val="222222"/>
+          <w:sz w:val="24"/>
+          <w:szCs w:val="24"/>
+        </w:rPr>
+        <w:t xml:space="preserve"> </w:t>
+      </w:r>
+      <w:proofErr w:type="spellStart"/>
+      <w:r>
+        <w:rPr>
+          <w:rFonts w:ascii="Times New Roman" w:hAnsi="Times New Roman" w:cs="Times New Roman"/>
+          <w:color w:val="222222"/>
+          <w:sz w:val="24"/>
+          <w:szCs w:val="24"/>
         </w:rPr>
         <w:t>gagal</w:t>
       </w:r>
@@ -8718,6 +8982,8 @@
         <w:rPr>
           <w:rFonts w:ascii="Times New Roman" w:hAnsi="Times New Roman" w:cs="Times New Roman"/>
           <w:color w:val="222222"/>
+          <w:sz w:val="24"/>
+          <w:szCs w:val="24"/>
         </w:rPr>
         <w:t xml:space="preserve"> di Command Prompt. Solusi: </w:t>
       </w:r>
@@ -8726,6 +8992,8 @@
         <w:rPr>
           <w:rFonts w:ascii="Times New Roman" w:hAnsi="Times New Roman" w:cs="Times New Roman"/>
           <w:color w:val="222222"/>
+          <w:sz w:val="24"/>
+          <w:szCs w:val="24"/>
         </w:rPr>
         <w:t>memakai</w:t>
       </w:r>
@@ -8734,6 +9002,8 @@
         <w:rPr>
           <w:rFonts w:ascii="Times New Roman" w:hAnsi="Times New Roman" w:cs="Times New Roman"/>
           <w:color w:val="222222"/>
+          <w:sz w:val="24"/>
+          <w:szCs w:val="24"/>
         </w:rPr>
         <w:t xml:space="preserve"> .</w:t>
       </w:r>
@@ -8742,6 +9012,8 @@
         <w:rPr>
           <w:rFonts w:ascii="Times New Roman" w:hAnsi="Times New Roman" w:cs="Times New Roman"/>
           <w:color w:val="222222"/>
+          <w:sz w:val="24"/>
+          <w:szCs w:val="24"/>
         </w:rPr>
         <w:t>venv</w:t>
       </w:r>
@@ -8750,6 +9022,8 @@
         <w:rPr>
           <w:rFonts w:ascii="Times New Roman" w:hAnsi="Times New Roman" w:cs="Times New Roman"/>
           <w:color w:val="222222"/>
+          <w:sz w:val="24"/>
+          <w:szCs w:val="24"/>
         </w:rPr>
         <w:t xml:space="preserve">\Scripts\activate.bat </w:t>
       </w:r>
@@ -8758,6 +9032,8 @@
         <w:rPr>
           <w:rFonts w:ascii="Times New Roman" w:hAnsi="Times New Roman" w:cs="Times New Roman"/>
           <w:color w:val="222222"/>
+          <w:sz w:val="24"/>
+          <w:szCs w:val="24"/>
         </w:rPr>
         <w:t>serta</w:t>
       </w:r>
@@ -8766,6 +9042,8 @@
         <w:rPr>
           <w:rFonts w:ascii="Times New Roman" w:hAnsi="Times New Roman" w:cs="Times New Roman"/>
           <w:color w:val="222222"/>
+          <w:sz w:val="24"/>
+          <w:szCs w:val="24"/>
         </w:rPr>
         <w:t xml:space="preserve"> set DBT_PROFILES_DIR=%CD% </w:t>
       </w:r>
@@ -8774,6 +9052,8 @@
         <w:rPr>
           <w:rFonts w:ascii="Times New Roman" w:hAnsi="Times New Roman" w:cs="Times New Roman"/>
           <w:color w:val="222222"/>
+          <w:sz w:val="24"/>
+          <w:szCs w:val="24"/>
         </w:rPr>
         <w:t>dari</w:t>
       </w:r>
@@ -8782,6 +9062,8 @@
         <w:rPr>
           <w:rFonts w:ascii="Times New Roman" w:hAnsi="Times New Roman" w:cs="Times New Roman"/>
           <w:color w:val="222222"/>
+          <w:sz w:val="24"/>
+          <w:szCs w:val="24"/>
         </w:rPr>
         <w:t xml:space="preserve"> folder </w:t>
       </w:r>
@@ -8790,6 +9072,8 @@
         <w:rPr>
           <w:rFonts w:ascii="Times New Roman" w:hAnsi="Times New Roman" w:cs="Times New Roman"/>
           <w:color w:val="222222"/>
+          <w:sz w:val="24"/>
+          <w:szCs w:val="24"/>
         </w:rPr>
         <w:t>dbt_project</w:t>
       </w:r>
@@ -8798,6 +9082,8 @@
         <w:rPr>
           <w:rFonts w:ascii="Times New Roman" w:hAnsi="Times New Roman" w:cs="Times New Roman"/>
           <w:color w:val="222222"/>
+          <w:sz w:val="24"/>
+          <w:szCs w:val="24"/>
         </w:rPr>
         <w:t>.</w:t>
       </w:r>
@@ -8813,6 +9099,8 @@
         <w:jc w:val="both"/>
         <w:rPr>
           <w:rFonts w:ascii="Times New Roman" w:hAnsi="Times New Roman" w:cs="Times New Roman"/>
+          <w:sz w:val="24"/>
+          <w:szCs w:val="24"/>
         </w:rPr>
       </w:pPr>
       <w:proofErr w:type="spellStart"/>
@@ -8820,6 +9108,8 @@
         <w:rPr>
           <w:rFonts w:ascii="Times New Roman" w:hAnsi="Times New Roman" w:cs="Times New Roman"/>
           <w:color w:val="222222"/>
+          <w:sz w:val="24"/>
+          <w:szCs w:val="24"/>
         </w:rPr>
         <w:t>Fungsi</w:t>
       </w:r>
@@ -8828,6 +9118,8 @@
         <w:rPr>
           <w:rFonts w:ascii="Times New Roman" w:hAnsi="Times New Roman" w:cs="Times New Roman"/>
           <w:color w:val="222222"/>
+          <w:sz w:val="24"/>
+          <w:szCs w:val="24"/>
         </w:rPr>
         <w:t xml:space="preserve"> SQL </w:t>
       </w:r>
@@ -8836,6 +9128,8 @@
         <w:rPr>
           <w:rFonts w:ascii="Times New Roman" w:hAnsi="Times New Roman" w:cs="Times New Roman"/>
           <w:color w:val="222222"/>
+          <w:sz w:val="24"/>
+          <w:szCs w:val="24"/>
         </w:rPr>
         <w:t>initcap</w:t>
       </w:r>
@@ -8844,14 +9138,18 @@
         <w:rPr>
           <w:rFonts w:ascii="Times New Roman" w:hAnsi="Times New Roman" w:cs="Times New Roman"/>
           <w:color w:val="222222"/>
-        </w:rPr>
-        <w:t xml:space="preserve"> </w:t>
-      </w:r>
-      <w:proofErr w:type="spellStart"/>
-      <w:r>
-        <w:rPr>
-          <w:rFonts w:ascii="Times New Roman" w:hAnsi="Times New Roman" w:cs="Times New Roman"/>
-          <w:color w:val="222222"/>
+          <w:sz w:val="24"/>
+          <w:szCs w:val="24"/>
+        </w:rPr>
+        <w:t xml:space="preserve"> </w:t>
+      </w:r>
+      <w:proofErr w:type="spellStart"/>
+      <w:r>
+        <w:rPr>
+          <w:rFonts w:ascii="Times New Roman" w:hAnsi="Times New Roman" w:cs="Times New Roman"/>
+          <w:color w:val="222222"/>
+          <w:sz w:val="24"/>
+          <w:szCs w:val="24"/>
         </w:rPr>
         <w:t>tidak</w:t>
       </w:r>
@@ -8860,14 +9158,18 @@
         <w:rPr>
           <w:rFonts w:ascii="Times New Roman" w:hAnsi="Times New Roman" w:cs="Times New Roman"/>
           <w:color w:val="222222"/>
-        </w:rPr>
-        <w:t xml:space="preserve"> </w:t>
-      </w:r>
-      <w:proofErr w:type="spellStart"/>
-      <w:r>
-        <w:rPr>
-          <w:rFonts w:ascii="Times New Roman" w:hAnsi="Times New Roman" w:cs="Times New Roman"/>
-          <w:color w:val="222222"/>
+          <w:sz w:val="24"/>
+          <w:szCs w:val="24"/>
+        </w:rPr>
+        <w:t xml:space="preserve"> </w:t>
+      </w:r>
+      <w:proofErr w:type="spellStart"/>
+      <w:r>
+        <w:rPr>
+          <w:rFonts w:ascii="Times New Roman" w:hAnsi="Times New Roman" w:cs="Times New Roman"/>
+          <w:color w:val="222222"/>
+          <w:sz w:val="24"/>
+          <w:szCs w:val="24"/>
         </w:rPr>
         <w:t>tersedia</w:t>
       </w:r>
@@ -8876,6 +9178,8 @@
         <w:rPr>
           <w:rFonts w:ascii="Times New Roman" w:hAnsi="Times New Roman" w:cs="Times New Roman"/>
           <w:color w:val="222222"/>
+          <w:sz w:val="24"/>
+          <w:szCs w:val="24"/>
         </w:rPr>
         <w:t xml:space="preserve"> di </w:t>
       </w:r>
@@ -8884,6 +9188,8 @@
         <w:rPr>
           <w:rFonts w:ascii="Times New Roman" w:hAnsi="Times New Roman" w:cs="Times New Roman"/>
           <w:color w:val="222222"/>
+          <w:sz w:val="24"/>
+          <w:szCs w:val="24"/>
         </w:rPr>
         <w:t>DuckDB</w:t>
       </w:r>
@@ -8892,6 +9198,8 @@
         <w:rPr>
           <w:rFonts w:ascii="Times New Roman" w:hAnsi="Times New Roman" w:cs="Times New Roman"/>
           <w:color w:val="222222"/>
+          <w:sz w:val="24"/>
+          <w:szCs w:val="24"/>
         </w:rPr>
         <w:t xml:space="preserve">, </w:t>
       </w:r>
@@ -8900,6 +9208,8 @@
         <w:rPr>
           <w:rFonts w:ascii="Times New Roman" w:hAnsi="Times New Roman" w:cs="Times New Roman"/>
           <w:color w:val="222222"/>
+          <w:sz w:val="24"/>
+          <w:szCs w:val="24"/>
         </w:rPr>
         <w:t>sehingga</w:t>
       </w:r>
@@ -8908,14 +9218,18 @@
         <w:rPr>
           <w:rFonts w:ascii="Times New Roman" w:hAnsi="Times New Roman" w:cs="Times New Roman"/>
           <w:color w:val="222222"/>
-        </w:rPr>
-        <w:t xml:space="preserve"> </w:t>
-      </w:r>
-      <w:proofErr w:type="spellStart"/>
-      <w:r>
-        <w:rPr>
-          <w:rFonts w:ascii="Times New Roman" w:hAnsi="Times New Roman" w:cs="Times New Roman"/>
-          <w:color w:val="222222"/>
+          <w:sz w:val="24"/>
+          <w:szCs w:val="24"/>
+        </w:rPr>
+        <w:t xml:space="preserve"> </w:t>
+      </w:r>
+      <w:proofErr w:type="spellStart"/>
+      <w:r>
+        <w:rPr>
+          <w:rFonts w:ascii="Times New Roman" w:hAnsi="Times New Roman" w:cs="Times New Roman"/>
+          <w:color w:val="222222"/>
+          <w:sz w:val="24"/>
+          <w:szCs w:val="24"/>
         </w:rPr>
         <w:t>dbt</w:t>
       </w:r>
@@ -8924,6 +9238,8 @@
         <w:rPr>
           <w:rFonts w:ascii="Times New Roman" w:hAnsi="Times New Roman" w:cs="Times New Roman"/>
           <w:color w:val="222222"/>
+          <w:sz w:val="24"/>
+          <w:szCs w:val="24"/>
         </w:rPr>
         <w:t xml:space="preserve"> run staging </w:t>
       </w:r>
@@ -8932,6 +9248,8 @@
         <w:rPr>
           <w:rFonts w:ascii="Times New Roman" w:hAnsi="Times New Roman" w:cs="Times New Roman"/>
           <w:color w:val="222222"/>
+          <w:sz w:val="24"/>
+          <w:szCs w:val="24"/>
         </w:rPr>
         <w:t>gagal</w:t>
       </w:r>
@@ -8940,6 +9258,8 @@
         <w:rPr>
           <w:rFonts w:ascii="Times New Roman" w:hAnsi="Times New Roman" w:cs="Times New Roman"/>
           <w:color w:val="222222"/>
+          <w:sz w:val="24"/>
+          <w:szCs w:val="24"/>
         </w:rPr>
         <w:t xml:space="preserve">. Solusi: title-case </w:t>
       </w:r>
@@ -8948,6 +9268,8 @@
         <w:rPr>
           <w:rFonts w:ascii="Times New Roman" w:hAnsi="Times New Roman" w:cs="Times New Roman"/>
           <w:color w:val="222222"/>
+          <w:sz w:val="24"/>
+          <w:szCs w:val="24"/>
         </w:rPr>
         <w:t>dengan</w:t>
       </w:r>
@@ -8956,14 +9278,18 @@
         <w:rPr>
           <w:rFonts w:ascii="Times New Roman" w:hAnsi="Times New Roman" w:cs="Times New Roman"/>
           <w:color w:val="222222"/>
-        </w:rPr>
-        <w:t xml:space="preserve"> </w:t>
-      </w:r>
-      <w:proofErr w:type="spellStart"/>
-      <w:r>
-        <w:rPr>
-          <w:rFonts w:ascii="Times New Roman" w:hAnsi="Times New Roman" w:cs="Times New Roman"/>
-          <w:color w:val="222222"/>
+          <w:sz w:val="24"/>
+          <w:szCs w:val="24"/>
+        </w:rPr>
+        <w:t xml:space="preserve"> </w:t>
+      </w:r>
+      <w:proofErr w:type="spellStart"/>
+      <w:r>
+        <w:rPr>
+          <w:rFonts w:ascii="Times New Roman" w:hAnsi="Times New Roman" w:cs="Times New Roman"/>
+          <w:color w:val="222222"/>
+          <w:sz w:val="24"/>
+          <w:szCs w:val="24"/>
         </w:rPr>
         <w:t>concat</w:t>
       </w:r>
@@ -8972,6 +9298,8 @@
         <w:rPr>
           <w:rFonts w:ascii="Times New Roman" w:hAnsi="Times New Roman" w:cs="Times New Roman"/>
           <w:color w:val="222222"/>
+          <w:sz w:val="24"/>
+          <w:szCs w:val="24"/>
         </w:rPr>
         <w:t>(upper(left(...)), lower(</w:t>
       </w:r>
@@ -8980,6 +9308,8 @@
         <w:rPr>
           <w:rFonts w:ascii="Times New Roman" w:hAnsi="Times New Roman" w:cs="Times New Roman"/>
           <w:color w:val="222222"/>
+          <w:sz w:val="24"/>
+          <w:szCs w:val="24"/>
         </w:rPr>
         <w:t>substr</w:t>
       </w:r>
@@ -8988,6 +9318,8 @@
         <w:rPr>
           <w:rFonts w:ascii="Times New Roman" w:hAnsi="Times New Roman" w:cs="Times New Roman"/>
           <w:color w:val="222222"/>
+          <w:sz w:val="24"/>
+          <w:szCs w:val="24"/>
         </w:rPr>
         <w:t>(...))).</w:t>
       </w:r>
@@ -9003,12 +9335,16 @@
         <w:jc w:val="both"/>
         <w:rPr>
           <w:rFonts w:ascii="Times New Roman" w:hAnsi="Times New Roman" w:cs="Times New Roman"/>
+          <w:sz w:val="24"/>
+          <w:szCs w:val="24"/>
         </w:rPr>
       </w:pPr>
       <w:r>
         <w:rPr>
           <w:rFonts w:ascii="Times New Roman" w:hAnsi="Times New Roman" w:cs="Times New Roman"/>
           <w:color w:val="222222"/>
+          <w:sz w:val="24"/>
+          <w:szCs w:val="24"/>
         </w:rPr>
         <w:t xml:space="preserve">Line chart Power BI </w:t>
       </w:r>
@@ -9017,6 +9353,8 @@
         <w:rPr>
           <w:rFonts w:ascii="Times New Roman" w:hAnsi="Times New Roman" w:cs="Times New Roman"/>
           <w:color w:val="222222"/>
+          <w:sz w:val="24"/>
+          <w:szCs w:val="24"/>
         </w:rPr>
         <w:t>sempat</w:t>
       </w:r>
@@ -9025,14 +9363,18 @@
         <w:rPr>
           <w:rFonts w:ascii="Times New Roman" w:hAnsi="Times New Roman" w:cs="Times New Roman"/>
           <w:color w:val="222222"/>
-        </w:rPr>
-        <w:t xml:space="preserve"> </w:t>
-      </w:r>
-      <w:proofErr w:type="spellStart"/>
-      <w:r>
-        <w:rPr>
-          <w:rFonts w:ascii="Times New Roman" w:hAnsi="Times New Roman" w:cs="Times New Roman"/>
-          <w:color w:val="222222"/>
+          <w:sz w:val="24"/>
+          <w:szCs w:val="24"/>
+        </w:rPr>
+        <w:t xml:space="preserve"> </w:t>
+      </w:r>
+      <w:proofErr w:type="spellStart"/>
+      <w:r>
+        <w:rPr>
+          <w:rFonts w:ascii="Times New Roman" w:hAnsi="Times New Roman" w:cs="Times New Roman"/>
+          <w:color w:val="222222"/>
+          <w:sz w:val="24"/>
+          <w:szCs w:val="24"/>
         </w:rPr>
         <w:t>memakai</w:t>
       </w:r>
@@ -9041,14 +9383,18 @@
         <w:rPr>
           <w:rFonts w:ascii="Times New Roman" w:hAnsi="Times New Roman" w:cs="Times New Roman"/>
           <w:color w:val="222222"/>
-        </w:rPr>
-        <w:t xml:space="preserve"> </w:t>
-      </w:r>
-      <w:proofErr w:type="spellStart"/>
-      <w:r>
-        <w:rPr>
-          <w:rFonts w:ascii="Times New Roman" w:hAnsi="Times New Roman" w:cs="Times New Roman"/>
-          <w:color w:val="222222"/>
+          <w:sz w:val="24"/>
+          <w:szCs w:val="24"/>
+        </w:rPr>
+        <w:t xml:space="preserve"> </w:t>
+      </w:r>
+      <w:proofErr w:type="spellStart"/>
+      <w:r>
+        <w:rPr>
+          <w:rFonts w:ascii="Times New Roman" w:hAnsi="Times New Roman" w:cs="Times New Roman"/>
+          <w:color w:val="222222"/>
+          <w:sz w:val="24"/>
+          <w:szCs w:val="24"/>
         </w:rPr>
         <w:t>sumbu</w:t>
       </w:r>
@@ -9057,6 +9403,8 @@
         <w:rPr>
           <w:rFonts w:ascii="Times New Roman" w:hAnsi="Times New Roman" w:cs="Times New Roman"/>
           <w:color w:val="222222"/>
+          <w:sz w:val="24"/>
+          <w:szCs w:val="24"/>
         </w:rPr>
         <w:t xml:space="preserve"> Year </w:t>
       </w:r>
@@ -9065,6 +9413,8 @@
         <w:rPr>
           <w:rFonts w:ascii="Times New Roman" w:hAnsi="Times New Roman" w:cs="Times New Roman"/>
           <w:color w:val="222222"/>
+          <w:sz w:val="24"/>
+          <w:szCs w:val="24"/>
         </w:rPr>
         <w:t>sehingga</w:t>
       </w:r>
@@ -9073,14 +9423,18 @@
         <w:rPr>
           <w:rFonts w:ascii="Times New Roman" w:hAnsi="Times New Roman" w:cs="Times New Roman"/>
           <w:color w:val="222222"/>
-        </w:rPr>
-        <w:t xml:space="preserve"> </w:t>
-      </w:r>
-      <w:proofErr w:type="spellStart"/>
-      <w:r>
-        <w:rPr>
-          <w:rFonts w:ascii="Times New Roman" w:hAnsi="Times New Roman" w:cs="Times New Roman"/>
-          <w:color w:val="222222"/>
+          <w:sz w:val="24"/>
+          <w:szCs w:val="24"/>
+        </w:rPr>
+        <w:t xml:space="preserve"> </w:t>
+      </w:r>
+      <w:proofErr w:type="spellStart"/>
+      <w:r>
+        <w:rPr>
+          <w:rFonts w:ascii="Times New Roman" w:hAnsi="Times New Roman" w:cs="Times New Roman"/>
+          <w:color w:val="222222"/>
+          <w:sz w:val="24"/>
+          <w:szCs w:val="24"/>
         </w:rPr>
         <w:t>penurunan</w:t>
       </w:r>
@@ -9089,6 +9443,8 @@
         <w:rPr>
           <w:rFonts w:ascii="Times New Roman" w:hAnsi="Times New Roman" w:cs="Times New Roman"/>
           <w:color w:val="222222"/>
+          <w:sz w:val="24"/>
+          <w:szCs w:val="24"/>
         </w:rPr>
         <w:t xml:space="preserve"> 2026 </w:t>
       </w:r>
@@ -9097,6 +9453,8 @@
         <w:rPr>
           <w:rFonts w:ascii="Times New Roman" w:hAnsi="Times New Roman" w:cs="Times New Roman"/>
           <w:color w:val="222222"/>
+          <w:sz w:val="24"/>
+          <w:szCs w:val="24"/>
         </w:rPr>
         <w:t>terlihat</w:t>
       </w:r>
@@ -9105,14 +9463,18 @@
         <w:rPr>
           <w:rFonts w:ascii="Times New Roman" w:hAnsi="Times New Roman" w:cs="Times New Roman"/>
           <w:color w:val="222222"/>
-        </w:rPr>
-        <w:t xml:space="preserve"> </w:t>
-      </w:r>
-      <w:proofErr w:type="spellStart"/>
-      <w:r>
-        <w:rPr>
-          <w:rFonts w:ascii="Times New Roman" w:hAnsi="Times New Roman" w:cs="Times New Roman"/>
-          <w:color w:val="222222"/>
+          <w:sz w:val="24"/>
+          <w:szCs w:val="24"/>
+        </w:rPr>
+        <w:t xml:space="preserve"> </w:t>
+      </w:r>
+      <w:proofErr w:type="spellStart"/>
+      <w:r>
+        <w:rPr>
+          <w:rFonts w:ascii="Times New Roman" w:hAnsi="Times New Roman" w:cs="Times New Roman"/>
+          <w:color w:val="222222"/>
+          <w:sz w:val="24"/>
+          <w:szCs w:val="24"/>
         </w:rPr>
         <w:t>seolah</w:t>
       </w:r>
@@ -9121,14 +9483,18 @@
         <w:rPr>
           <w:rFonts w:ascii="Times New Roman" w:hAnsi="Times New Roman" w:cs="Times New Roman"/>
           <w:color w:val="222222"/>
-        </w:rPr>
-        <w:t xml:space="preserve"> </w:t>
-      </w:r>
-      <w:proofErr w:type="spellStart"/>
-      <w:r>
-        <w:rPr>
-          <w:rFonts w:ascii="Times New Roman" w:hAnsi="Times New Roman" w:cs="Times New Roman"/>
-          <w:color w:val="222222"/>
+          <w:sz w:val="24"/>
+          <w:szCs w:val="24"/>
+        </w:rPr>
+        <w:t xml:space="preserve"> </w:t>
+      </w:r>
+      <w:proofErr w:type="spellStart"/>
+      <w:r>
+        <w:rPr>
+          <w:rFonts w:ascii="Times New Roman" w:hAnsi="Times New Roman" w:cs="Times New Roman"/>
+          <w:color w:val="222222"/>
+          <w:sz w:val="24"/>
+          <w:szCs w:val="24"/>
         </w:rPr>
         <w:t>penjualan</w:t>
       </w:r>
@@ -9137,14 +9503,18 @@
         <w:rPr>
           <w:rFonts w:ascii="Times New Roman" w:hAnsi="Times New Roman" w:cs="Times New Roman"/>
           <w:color w:val="222222"/>
-        </w:rPr>
-        <w:t xml:space="preserve"> </w:t>
-      </w:r>
-      <w:proofErr w:type="spellStart"/>
-      <w:r>
-        <w:rPr>
-          <w:rFonts w:ascii="Times New Roman" w:hAnsi="Times New Roman" w:cs="Times New Roman"/>
-          <w:color w:val="222222"/>
+          <w:sz w:val="24"/>
+          <w:szCs w:val="24"/>
+        </w:rPr>
+        <w:t xml:space="preserve"> </w:t>
+      </w:r>
+      <w:proofErr w:type="spellStart"/>
+      <w:r>
+        <w:rPr>
+          <w:rFonts w:ascii="Times New Roman" w:hAnsi="Times New Roman" w:cs="Times New Roman"/>
+          <w:color w:val="222222"/>
+          <w:sz w:val="24"/>
+          <w:szCs w:val="24"/>
         </w:rPr>
         <w:t>anjlok</w:t>
       </w:r>
@@ -9153,6 +9523,8 @@
         <w:rPr>
           <w:rFonts w:ascii="Times New Roman" w:hAnsi="Times New Roman" w:cs="Times New Roman"/>
           <w:color w:val="222222"/>
+          <w:sz w:val="24"/>
+          <w:szCs w:val="24"/>
         </w:rPr>
         <w:t xml:space="preserve">, </w:t>
       </w:r>
@@ -9161,6 +9533,8 @@
         <w:rPr>
           <w:rFonts w:ascii="Times New Roman" w:hAnsi="Times New Roman" w:cs="Times New Roman"/>
           <w:color w:val="222222"/>
+          <w:sz w:val="24"/>
+          <w:szCs w:val="24"/>
         </w:rPr>
         <w:t>padahal</w:t>
       </w:r>
@@ -9169,6 +9543,8 @@
         <w:rPr>
           <w:rFonts w:ascii="Times New Roman" w:hAnsi="Times New Roman" w:cs="Times New Roman"/>
           <w:color w:val="222222"/>
+          <w:sz w:val="24"/>
+          <w:szCs w:val="24"/>
         </w:rPr>
         <w:t xml:space="preserve"> data </w:t>
       </w:r>
@@ -9177,6 +9553,8 @@
         <w:rPr>
           <w:rFonts w:ascii="Times New Roman" w:hAnsi="Times New Roman" w:cs="Times New Roman"/>
           <w:color w:val="222222"/>
+          <w:sz w:val="24"/>
+          <w:szCs w:val="24"/>
         </w:rPr>
         <w:t>hanya</w:t>
       </w:r>
@@ -9185,14 +9563,18 @@
         <w:rPr>
           <w:rFonts w:ascii="Times New Roman" w:hAnsi="Times New Roman" w:cs="Times New Roman"/>
           <w:color w:val="222222"/>
-        </w:rPr>
-        <w:t xml:space="preserve"> </w:t>
-      </w:r>
-      <w:proofErr w:type="spellStart"/>
-      <w:r>
-        <w:rPr>
-          <w:rFonts w:ascii="Times New Roman" w:hAnsi="Times New Roman" w:cs="Times New Roman"/>
-          <w:color w:val="222222"/>
+          <w:sz w:val="24"/>
+          <w:szCs w:val="24"/>
+        </w:rPr>
+        <w:t xml:space="preserve"> </w:t>
+      </w:r>
+      <w:proofErr w:type="spellStart"/>
+      <w:r>
+        <w:rPr>
+          <w:rFonts w:ascii="Times New Roman" w:hAnsi="Times New Roman" w:cs="Times New Roman"/>
+          <w:color w:val="222222"/>
+          <w:sz w:val="24"/>
+          <w:szCs w:val="24"/>
         </w:rPr>
         <w:t>sampai</w:t>
       </w:r>
@@ -9201,6 +9583,8 @@
         <w:rPr>
           <w:rFonts w:ascii="Times New Roman" w:hAnsi="Times New Roman" w:cs="Times New Roman"/>
           <w:color w:val="222222"/>
+          <w:sz w:val="24"/>
+          <w:szCs w:val="24"/>
         </w:rPr>
         <w:t xml:space="preserve"> 17 </w:t>
       </w:r>
@@ -9209,6 +9593,8 @@
         <w:rPr>
           <w:rFonts w:ascii="Times New Roman" w:hAnsi="Times New Roman" w:cs="Times New Roman"/>
           <w:color w:val="222222"/>
+          <w:sz w:val="24"/>
+          <w:szCs w:val="24"/>
         </w:rPr>
         <w:t>Februari</w:t>
       </w:r>
@@ -9217,6 +9603,8 @@
         <w:rPr>
           <w:rFonts w:ascii="Times New Roman" w:hAnsi="Times New Roman" w:cs="Times New Roman"/>
           <w:color w:val="222222"/>
+          <w:sz w:val="24"/>
+          <w:szCs w:val="24"/>
         </w:rPr>
         <w:t xml:space="preserve"> 2026. Solusi: </w:t>
       </w:r>
@@ -9225,6 +9613,8 @@
         <w:rPr>
           <w:rFonts w:ascii="Times New Roman" w:hAnsi="Times New Roman" w:cs="Times New Roman"/>
           <w:color w:val="222222"/>
+          <w:sz w:val="24"/>
+          <w:szCs w:val="24"/>
         </w:rPr>
         <w:t>hierarki</w:t>
       </w:r>
@@ -9233,14 +9623,18 @@
         <w:rPr>
           <w:rFonts w:ascii="Times New Roman" w:hAnsi="Times New Roman" w:cs="Times New Roman"/>
           <w:color w:val="222222"/>
-        </w:rPr>
-        <w:t xml:space="preserve"> </w:t>
-      </w:r>
-      <w:proofErr w:type="spellStart"/>
-      <w:r>
-        <w:rPr>
-          <w:rFonts w:ascii="Times New Roman" w:hAnsi="Times New Roman" w:cs="Times New Roman"/>
-          <w:color w:val="222222"/>
+          <w:sz w:val="24"/>
+          <w:szCs w:val="24"/>
+        </w:rPr>
+        <w:t xml:space="preserve"> </w:t>
+      </w:r>
+      <w:proofErr w:type="spellStart"/>
+      <w:r>
+        <w:rPr>
+          <w:rFonts w:ascii="Times New Roman" w:hAnsi="Times New Roman" w:cs="Times New Roman"/>
+          <w:color w:val="222222"/>
+          <w:sz w:val="24"/>
+          <w:szCs w:val="24"/>
         </w:rPr>
         <w:t>tanggal</w:t>
       </w:r>
@@ -9249,14 +9643,18 @@
         <w:rPr>
           <w:rFonts w:ascii="Times New Roman" w:hAnsi="Times New Roman" w:cs="Times New Roman"/>
           <w:color w:val="222222"/>
-        </w:rPr>
-        <w:t xml:space="preserve"> </w:t>
-      </w:r>
-      <w:proofErr w:type="spellStart"/>
-      <w:r>
-        <w:rPr>
-          <w:rFonts w:ascii="Times New Roman" w:hAnsi="Times New Roman" w:cs="Times New Roman"/>
-          <w:color w:val="222222"/>
+          <w:sz w:val="24"/>
+          <w:szCs w:val="24"/>
+        </w:rPr>
+        <w:t xml:space="preserve"> </w:t>
+      </w:r>
+      <w:proofErr w:type="spellStart"/>
+      <w:r>
+        <w:rPr>
+          <w:rFonts w:ascii="Times New Roman" w:hAnsi="Times New Roman" w:cs="Times New Roman"/>
+          <w:color w:val="222222"/>
+          <w:sz w:val="24"/>
+          <w:szCs w:val="24"/>
         </w:rPr>
         <w:t>dengan</w:t>
       </w:r>
@@ -9265,14 +9663,18 @@
         <w:rPr>
           <w:rFonts w:ascii="Times New Roman" w:hAnsi="Times New Roman" w:cs="Times New Roman"/>
           <w:color w:val="222222"/>
-        </w:rPr>
-        <w:t xml:space="preserve"> </w:t>
-      </w:r>
-      <w:proofErr w:type="spellStart"/>
-      <w:r>
-        <w:rPr>
-          <w:rFonts w:ascii="Times New Roman" w:hAnsi="Times New Roman" w:cs="Times New Roman"/>
-          <w:color w:val="222222"/>
+          <w:sz w:val="24"/>
+          <w:szCs w:val="24"/>
+        </w:rPr>
+        <w:t xml:space="preserve"> </w:t>
+      </w:r>
+      <w:proofErr w:type="spellStart"/>
+      <w:r>
+        <w:rPr>
+          <w:rFonts w:ascii="Times New Roman" w:hAnsi="Times New Roman" w:cs="Times New Roman"/>
+          <w:color w:val="222222"/>
+          <w:sz w:val="24"/>
+          <w:szCs w:val="24"/>
         </w:rPr>
         <w:t>tampilan</w:t>
       </w:r>
@@ -9281,14 +9683,18 @@
         <w:rPr>
           <w:rFonts w:ascii="Times New Roman" w:hAnsi="Times New Roman" w:cs="Times New Roman"/>
           <w:color w:val="222222"/>
-        </w:rPr>
-        <w:t xml:space="preserve"> </w:t>
-      </w:r>
-      <w:proofErr w:type="spellStart"/>
-      <w:r>
-        <w:rPr>
-          <w:rFonts w:ascii="Times New Roman" w:hAnsi="Times New Roman" w:cs="Times New Roman"/>
-          <w:color w:val="222222"/>
+          <w:sz w:val="24"/>
+          <w:szCs w:val="24"/>
+        </w:rPr>
+        <w:t xml:space="preserve"> </w:t>
+      </w:r>
+      <w:proofErr w:type="spellStart"/>
+      <w:r>
+        <w:rPr>
+          <w:rFonts w:ascii="Times New Roman" w:hAnsi="Times New Roman" w:cs="Times New Roman"/>
+          <w:color w:val="222222"/>
+          <w:sz w:val="24"/>
+          <w:szCs w:val="24"/>
         </w:rPr>
         <w:t>bulan</w:t>
       </w:r>
@@ -9297,6 +9703,8 @@
         <w:rPr>
           <w:rFonts w:ascii="Times New Roman" w:hAnsi="Times New Roman" w:cs="Times New Roman"/>
           <w:color w:val="222222"/>
+          <w:sz w:val="24"/>
+          <w:szCs w:val="24"/>
         </w:rPr>
         <w:t xml:space="preserve"> dan drill-down </w:t>
       </w:r>
@@ -9305,6 +9713,8 @@
         <w:rPr>
           <w:rFonts w:ascii="Times New Roman" w:hAnsi="Times New Roman" w:cs="Times New Roman"/>
           <w:color w:val="222222"/>
+          <w:sz w:val="24"/>
+          <w:szCs w:val="24"/>
         </w:rPr>
         <w:t>ke</w:t>
       </w:r>
@@ -9313,14 +9723,18 @@
         <w:rPr>
           <w:rFonts w:ascii="Times New Roman" w:hAnsi="Times New Roman" w:cs="Times New Roman"/>
           <w:color w:val="222222"/>
-        </w:rPr>
-        <w:t xml:space="preserve"> </w:t>
-      </w:r>
-      <w:proofErr w:type="spellStart"/>
-      <w:r>
-        <w:rPr>
-          <w:rFonts w:ascii="Times New Roman" w:hAnsi="Times New Roman" w:cs="Times New Roman"/>
-          <w:color w:val="222222"/>
+          <w:sz w:val="24"/>
+          <w:szCs w:val="24"/>
+        </w:rPr>
+        <w:t xml:space="preserve"> </w:t>
+      </w:r>
+      <w:proofErr w:type="spellStart"/>
+      <w:r>
+        <w:rPr>
+          <w:rFonts w:ascii="Times New Roman" w:hAnsi="Times New Roman" w:cs="Times New Roman"/>
+          <w:color w:val="222222"/>
+          <w:sz w:val="24"/>
+          <w:szCs w:val="24"/>
         </w:rPr>
         <w:t>hari</w:t>
       </w:r>
@@ -9329,6 +9743,8 @@
         <w:rPr>
           <w:rFonts w:ascii="Times New Roman" w:hAnsi="Times New Roman" w:cs="Times New Roman"/>
           <w:color w:val="222222"/>
+          <w:sz w:val="24"/>
+          <w:szCs w:val="24"/>
         </w:rPr>
         <w:t>.</w:t>
       </w:r>
@@ -9344,12 +9760,16 @@
         <w:jc w:val="both"/>
         <w:rPr>
           <w:rFonts w:ascii="Times New Roman" w:hAnsi="Times New Roman" w:cs="Times New Roman"/>
+          <w:sz w:val="24"/>
+          <w:szCs w:val="24"/>
         </w:rPr>
       </w:pPr>
       <w:r>
         <w:rPr>
           <w:rFonts w:ascii="Times New Roman" w:hAnsi="Times New Roman" w:cs="Times New Roman"/>
           <w:color w:val="222222"/>
+          <w:sz w:val="24"/>
+          <w:szCs w:val="24"/>
         </w:rPr>
         <w:t xml:space="preserve">Dua </w:t>
       </w:r>
@@ -9358,6 +9778,8 @@
         <w:rPr>
           <w:rFonts w:ascii="Times New Roman" w:hAnsi="Times New Roman" w:cs="Times New Roman"/>
           <w:color w:val="222222"/>
+          <w:sz w:val="24"/>
+          <w:szCs w:val="24"/>
         </w:rPr>
         <w:t>halaman</w:t>
       </w:r>
@@ -9366,14 +9788,18 @@
         <w:rPr>
           <w:rFonts w:ascii="Times New Roman" w:hAnsi="Times New Roman" w:cs="Times New Roman"/>
           <w:color w:val="222222"/>
-        </w:rPr>
-        <w:t xml:space="preserve"> </w:t>
-      </w:r>
-      <w:proofErr w:type="spellStart"/>
-      <w:r>
-        <w:rPr>
-          <w:rFonts w:ascii="Times New Roman" w:hAnsi="Times New Roman" w:cs="Times New Roman"/>
-          <w:color w:val="222222"/>
+          <w:sz w:val="24"/>
+          <w:szCs w:val="24"/>
+        </w:rPr>
+        <w:t xml:space="preserve"> </w:t>
+      </w:r>
+      <w:proofErr w:type="spellStart"/>
+      <w:r>
+        <w:rPr>
+          <w:rFonts w:ascii="Times New Roman" w:hAnsi="Times New Roman" w:cs="Times New Roman"/>
+          <w:color w:val="222222"/>
+          <w:sz w:val="24"/>
+          <w:szCs w:val="24"/>
         </w:rPr>
         <w:t>sempat</w:t>
       </w:r>
@@ -9382,14 +9808,18 @@
         <w:rPr>
           <w:rFonts w:ascii="Times New Roman" w:hAnsi="Times New Roman" w:cs="Times New Roman"/>
           <w:color w:val="222222"/>
-        </w:rPr>
-        <w:t xml:space="preserve"> </w:t>
-      </w:r>
-      <w:proofErr w:type="spellStart"/>
-      <w:r>
-        <w:rPr>
-          <w:rFonts w:ascii="Times New Roman" w:hAnsi="Times New Roman" w:cs="Times New Roman"/>
-          <w:color w:val="222222"/>
+          <w:sz w:val="24"/>
+          <w:szCs w:val="24"/>
+        </w:rPr>
+        <w:t xml:space="preserve"> </w:t>
+      </w:r>
+      <w:proofErr w:type="spellStart"/>
+      <w:r>
+        <w:rPr>
+          <w:rFonts w:ascii="Times New Roman" w:hAnsi="Times New Roman" w:cs="Times New Roman"/>
+          <w:color w:val="222222"/>
+          <w:sz w:val="24"/>
+          <w:szCs w:val="24"/>
         </w:rPr>
         <w:t>memakai</w:t>
       </w:r>
@@ -9398,6 +9828,8 @@
         <w:rPr>
           <w:rFonts w:ascii="Times New Roman" w:hAnsi="Times New Roman" w:cs="Times New Roman"/>
           <w:color w:val="222222"/>
+          <w:sz w:val="24"/>
+          <w:szCs w:val="24"/>
         </w:rPr>
         <w:t xml:space="preserve"> bar ranking wilayah yang </w:t>
       </w:r>
@@ -9406,6 +9838,8 @@
         <w:rPr>
           <w:rFonts w:ascii="Times New Roman" w:hAnsi="Times New Roman" w:cs="Times New Roman"/>
           <w:color w:val="222222"/>
+          <w:sz w:val="24"/>
+          <w:szCs w:val="24"/>
         </w:rPr>
         <w:t>identik</w:t>
       </w:r>
@@ -9414,14 +9848,58 @@
         <w:rPr>
           <w:rFonts w:ascii="Times New Roman" w:hAnsi="Times New Roman" w:cs="Times New Roman"/>
           <w:color w:val="222222"/>
-        </w:rPr>
-        <w:t xml:space="preserve">. Solusi: ranking wilayah </w:t>
-      </w:r>
-      <w:proofErr w:type="spellStart"/>
-      <w:r>
-        <w:rPr>
-          <w:rFonts w:ascii="Times New Roman" w:hAnsi="Times New Roman" w:cs="Times New Roman"/>
-          <w:color w:val="222222"/>
+          <w:sz w:val="24"/>
+          <w:szCs w:val="24"/>
+        </w:rPr>
+        <w:t xml:space="preserve">, dan slicer list </w:t>
+      </w:r>
+      <w:proofErr w:type="spellStart"/>
+      <w:r>
+        <w:rPr>
+          <w:rFonts w:ascii="Times New Roman" w:hAnsi="Times New Roman" w:cs="Times New Roman"/>
+          <w:color w:val="222222"/>
+          <w:sz w:val="24"/>
+          <w:szCs w:val="24"/>
+        </w:rPr>
+        <w:t>memotong</w:t>
+      </w:r>
+      <w:proofErr w:type="spellEnd"/>
+      <w:r>
+        <w:rPr>
+          <w:rFonts w:ascii="Times New Roman" w:hAnsi="Times New Roman" w:cs="Times New Roman"/>
+          <w:color w:val="222222"/>
+          <w:sz w:val="24"/>
+          <w:szCs w:val="24"/>
+        </w:rPr>
+        <w:t xml:space="preserve"> </w:t>
+      </w:r>
+      <w:proofErr w:type="spellStart"/>
+      <w:r>
+        <w:rPr>
+          <w:rFonts w:ascii="Times New Roman" w:hAnsi="Times New Roman" w:cs="Times New Roman"/>
+          <w:color w:val="222222"/>
+          <w:sz w:val="24"/>
+          <w:szCs w:val="24"/>
+        </w:rPr>
+        <w:t>nilai</w:t>
+      </w:r>
+      <w:proofErr w:type="spellEnd"/>
+      <w:r>
+        <w:rPr>
+          <w:rFonts w:ascii="Times New Roman" w:hAnsi="Times New Roman" w:cs="Times New Roman"/>
+          <w:color w:val="222222"/>
+          <w:sz w:val="24"/>
+          <w:szCs w:val="24"/>
+        </w:rPr>
+        <w:t xml:space="preserve"> Home. Solusi: ranking wilayah </w:t>
+      </w:r>
+      <w:proofErr w:type="spellStart"/>
+      <w:r>
+        <w:rPr>
+          <w:rFonts w:ascii="Times New Roman" w:hAnsi="Times New Roman" w:cs="Times New Roman"/>
+          <w:color w:val="222222"/>
+          <w:sz w:val="24"/>
+          <w:szCs w:val="24"/>
         </w:rPr>
         <w:t>hanya</w:t>
       </w:r>
@@ -9430,6 +9908,8 @@
         <w:rPr>
           <w:rFonts w:ascii="Times New Roman" w:hAnsi="Times New Roman" w:cs="Times New Roman"/>
           <w:color w:val="222222"/>
+          <w:sz w:val="24"/>
+          <w:szCs w:val="24"/>
         </w:rPr>
         <w:t xml:space="preserve"> di Overview; </w:t>
       </w:r>
@@ -9438,6 +9918,8 @@
         <w:rPr>
           <w:rFonts w:ascii="Times New Roman" w:hAnsi="Times New Roman" w:cs="Times New Roman"/>
           <w:color w:val="222222"/>
+          <w:sz w:val="24"/>
+          <w:szCs w:val="24"/>
         </w:rPr>
         <w:t>halaman</w:t>
       </w:r>
@@ -9446,6 +9928,8 @@
         <w:rPr>
           <w:rFonts w:ascii="Times New Roman" w:hAnsi="Times New Roman" w:cs="Times New Roman"/>
           <w:color w:val="222222"/>
+          <w:sz w:val="24"/>
+          <w:szCs w:val="24"/>
         </w:rPr>
         <w:t xml:space="preserve"> 2 </w:t>
       </w:r>
@@ -9454,6 +9938,88 @@
         <w:rPr>
           <w:rFonts w:ascii="Times New Roman" w:hAnsi="Times New Roman" w:cs="Times New Roman"/>
           <w:color w:val="222222"/>
+          <w:sz w:val="24"/>
+          <w:szCs w:val="24"/>
+        </w:rPr>
+        <w:t>memakai</w:t>
+      </w:r>
+      <w:proofErr w:type="spellEnd"/>
+      <w:r>
+        <w:rPr>
+          <w:rFonts w:ascii="Times New Roman" w:hAnsi="Times New Roman" w:cs="Times New Roman"/>
+          <w:color w:val="222222"/>
+          <w:sz w:val="24"/>
+          <w:szCs w:val="24"/>
+        </w:rPr>
+        <w:t xml:space="preserve"> stacked 100% (mix) dan clustered column (</w:t>
+      </w:r>
+      <w:proofErr w:type="spellStart"/>
+      <w:r>
+        <w:rPr>
+          <w:rFonts w:ascii="Times New Roman" w:hAnsi="Times New Roman" w:cs="Times New Roman"/>
+          <w:color w:val="222222"/>
+          <w:sz w:val="24"/>
+          <w:szCs w:val="24"/>
+        </w:rPr>
+        <w:t>nilai</w:t>
+      </w:r>
+      <w:proofErr w:type="spellEnd"/>
+      <w:r>
+        <w:rPr>
+          <w:rFonts w:ascii="Times New Roman" w:hAnsi="Times New Roman" w:cs="Times New Roman"/>
+          <w:color w:val="222222"/>
+          <w:sz w:val="24"/>
+          <w:szCs w:val="24"/>
+        </w:rPr>
+        <w:t xml:space="preserve"> </w:t>
+      </w:r>
+      <w:proofErr w:type="spellStart"/>
+      <w:r>
+        <w:rPr>
+          <w:rFonts w:ascii="Times New Roman" w:hAnsi="Times New Roman" w:cs="Times New Roman"/>
+          <w:color w:val="222222"/>
+          <w:sz w:val="24"/>
+          <w:szCs w:val="24"/>
+        </w:rPr>
+        <w:t>absolut</w:t>
+      </w:r>
+      <w:proofErr w:type="spellEnd"/>
+      <w:r>
+        <w:rPr>
+          <w:rFonts w:ascii="Times New Roman" w:hAnsi="Times New Roman" w:cs="Times New Roman"/>
+          <w:color w:val="222222"/>
+          <w:sz w:val="24"/>
+          <w:szCs w:val="24"/>
+        </w:rPr>
+        <w:t xml:space="preserve">). Slicer </w:t>
+      </w:r>
+      <w:proofErr w:type="spellStart"/>
+      <w:r>
+        <w:rPr>
+          <w:rFonts w:ascii="Times New Roman" w:hAnsi="Times New Roman" w:cs="Times New Roman"/>
+          <w:color w:val="222222"/>
+          <w:sz w:val="24"/>
+          <w:szCs w:val="24"/>
+        </w:rPr>
+        <w:t>kategori</w:t>
+      </w:r>
+      <w:proofErr w:type="spellEnd"/>
+      <w:r>
+        <w:rPr>
+          <w:rFonts w:ascii="Times New Roman" w:hAnsi="Times New Roman" w:cs="Times New Roman"/>
+          <w:color w:val="222222"/>
+          <w:sz w:val="24"/>
+          <w:szCs w:val="24"/>
+        </w:rPr>
+        <w:t xml:space="preserve"> </w:t>
+      </w:r>
+      <w:proofErr w:type="spellStart"/>
+      <w:r>
+        <w:rPr>
+          <w:rFonts w:ascii="Times New Roman" w:hAnsi="Times New Roman" w:cs="Times New Roman"/>
+          <w:color w:val="222222"/>
+          <w:sz w:val="24"/>
+          <w:szCs w:val="24"/>
         </w:rPr>
         <w:t>diganti</w:t>
       </w:r>
@@ -9462,110 +10028,38 @@
         <w:rPr>
           <w:rFonts w:ascii="Times New Roman" w:hAnsi="Times New Roman" w:cs="Times New Roman"/>
           <w:color w:val="222222"/>
-        </w:rPr>
-        <w:t xml:space="preserve"> stacked 100% (mix) dan clustered column (</w:t>
-      </w:r>
-      <w:proofErr w:type="spellStart"/>
-      <w:r>
-        <w:rPr>
-          <w:rFonts w:ascii="Times New Roman" w:hAnsi="Times New Roman" w:cs="Times New Roman"/>
-          <w:color w:val="222222"/>
-        </w:rPr>
-        <w:t>nilai</w:t>
-      </w:r>
-      <w:proofErr w:type="spellEnd"/>
-      <w:r>
-        <w:rPr>
-          <w:rFonts w:ascii="Times New Roman" w:hAnsi="Times New Roman" w:cs="Times New Roman"/>
-          <w:color w:val="222222"/>
-        </w:rPr>
-        <w:t xml:space="preserve"> </w:t>
-      </w:r>
-      <w:proofErr w:type="spellStart"/>
-      <w:r>
-        <w:rPr>
-          <w:rFonts w:ascii="Times New Roman" w:hAnsi="Times New Roman" w:cs="Times New Roman"/>
-          <w:color w:val="222222"/>
-        </w:rPr>
-        <w:t>absolut</w:t>
-      </w:r>
-      <w:proofErr w:type="spellEnd"/>
-      <w:r>
-        <w:rPr>
-          <w:rFonts w:ascii="Times New Roman" w:hAnsi="Times New Roman" w:cs="Times New Roman"/>
-          <w:color w:val="222222"/>
-        </w:rPr>
-        <w:t xml:space="preserve">). Slicer list </w:t>
-      </w:r>
-      <w:proofErr w:type="spellStart"/>
-      <w:r>
-        <w:rPr>
-          <w:rFonts w:ascii="Times New Roman" w:hAnsi="Times New Roman" w:cs="Times New Roman"/>
-          <w:color w:val="222222"/>
-        </w:rPr>
-        <w:t>masih</w:t>
-      </w:r>
-      <w:proofErr w:type="spellEnd"/>
-      <w:r>
-        <w:rPr>
-          <w:rFonts w:ascii="Times New Roman" w:hAnsi="Times New Roman" w:cs="Times New Roman"/>
-          <w:color w:val="222222"/>
-        </w:rPr>
-        <w:t xml:space="preserve"> </w:t>
-      </w:r>
-      <w:proofErr w:type="spellStart"/>
-      <w:r>
-        <w:rPr>
-          <w:rFonts w:ascii="Times New Roman" w:hAnsi="Times New Roman" w:cs="Times New Roman"/>
-          <w:color w:val="222222"/>
-        </w:rPr>
-        <w:t>memotong</w:t>
-      </w:r>
-      <w:proofErr w:type="spellEnd"/>
-      <w:r>
-        <w:rPr>
-          <w:rFonts w:ascii="Times New Roman" w:hAnsi="Times New Roman" w:cs="Times New Roman"/>
-          <w:color w:val="222222"/>
-        </w:rPr>
-        <w:t xml:space="preserve"> Home di </w:t>
-      </w:r>
-      <w:proofErr w:type="spellStart"/>
-      <w:r>
-        <w:rPr>
-          <w:rFonts w:ascii="Times New Roman" w:hAnsi="Times New Roman" w:cs="Times New Roman"/>
-          <w:color w:val="222222"/>
-        </w:rPr>
-        <w:t>kotak</w:t>
-      </w:r>
-      <w:proofErr w:type="spellEnd"/>
-      <w:r>
-        <w:rPr>
-          <w:rFonts w:ascii="Times New Roman" w:hAnsi="Times New Roman" w:cs="Times New Roman"/>
-          <w:color w:val="222222"/>
-        </w:rPr>
-        <w:t xml:space="preserve"> filter, </w:t>
-      </w:r>
-      <w:proofErr w:type="spellStart"/>
-      <w:r>
-        <w:rPr>
-          <w:rFonts w:ascii="Times New Roman" w:hAnsi="Times New Roman" w:cs="Times New Roman"/>
-          <w:color w:val="222222"/>
-        </w:rPr>
-        <w:t>tetapi</w:t>
-      </w:r>
-      <w:proofErr w:type="spellEnd"/>
-      <w:r>
-        <w:rPr>
-          <w:rFonts w:ascii="Times New Roman" w:hAnsi="Times New Roman" w:cs="Times New Roman"/>
-          <w:color w:val="222222"/>
-        </w:rPr>
-        <w:t xml:space="preserve"> </w:t>
-      </w:r>
-      <w:proofErr w:type="spellStart"/>
-      <w:r>
-        <w:rPr>
-          <w:rFonts w:ascii="Times New Roman" w:hAnsi="Times New Roman" w:cs="Times New Roman"/>
-          <w:color w:val="222222"/>
+          <w:sz w:val="24"/>
+          <w:szCs w:val="24"/>
+        </w:rPr>
+        <w:t xml:space="preserve"> tile agar </w:t>
+      </w:r>
+      <w:proofErr w:type="spellStart"/>
+      <w:r>
+        <w:rPr>
+          <w:rFonts w:ascii="Times New Roman" w:hAnsi="Times New Roman" w:cs="Times New Roman"/>
+          <w:color w:val="222222"/>
+          <w:sz w:val="24"/>
+          <w:szCs w:val="24"/>
+        </w:rPr>
+        <w:t>keempat</w:t>
+      </w:r>
+      <w:proofErr w:type="spellEnd"/>
+      <w:r>
+        <w:rPr>
+          <w:rFonts w:ascii="Times New Roman" w:hAnsi="Times New Roman" w:cs="Times New Roman"/>
+          <w:color w:val="222222"/>
+          <w:sz w:val="24"/>
+          <w:szCs w:val="24"/>
+        </w:rPr>
+        <w:t xml:space="preserve"> </w:t>
+      </w:r>
+      <w:proofErr w:type="spellStart"/>
+      <w:r>
+        <w:rPr>
+          <w:rFonts w:ascii="Times New Roman" w:hAnsi="Times New Roman" w:cs="Times New Roman"/>
+          <w:color w:val="222222"/>
+          <w:sz w:val="24"/>
+          <w:szCs w:val="24"/>
         </w:rPr>
         <w:t>kategori</w:t>
       </w:r>
@@ -9574,46 +10068,38 @@
         <w:rPr>
           <w:rFonts w:ascii="Times New Roman" w:hAnsi="Times New Roman" w:cs="Times New Roman"/>
           <w:color w:val="222222"/>
-        </w:rPr>
-        <w:t xml:space="preserve"> </w:t>
-      </w:r>
-      <w:proofErr w:type="spellStart"/>
-      <w:r>
-        <w:rPr>
-          <w:rFonts w:ascii="Times New Roman" w:hAnsi="Times New Roman" w:cs="Times New Roman"/>
-          <w:color w:val="222222"/>
-        </w:rPr>
-        <w:t>itu</w:t>
-      </w:r>
-      <w:proofErr w:type="spellEnd"/>
-      <w:r>
-        <w:rPr>
-          <w:rFonts w:ascii="Times New Roman" w:hAnsi="Times New Roman" w:cs="Times New Roman"/>
-          <w:color w:val="222222"/>
-        </w:rPr>
-        <w:t xml:space="preserve"> </w:t>
-      </w:r>
-      <w:proofErr w:type="spellStart"/>
-      <w:r>
-        <w:rPr>
-          <w:rFonts w:ascii="Times New Roman" w:hAnsi="Times New Roman" w:cs="Times New Roman"/>
-          <w:color w:val="222222"/>
-        </w:rPr>
-        <w:t>tetap</w:t>
-      </w:r>
-      <w:proofErr w:type="spellEnd"/>
-      <w:r>
-        <w:rPr>
-          <w:rFonts w:ascii="Times New Roman" w:hAnsi="Times New Roman" w:cs="Times New Roman"/>
-          <w:color w:val="222222"/>
-        </w:rPr>
-        <w:t xml:space="preserve"> </w:t>
-      </w:r>
-      <w:proofErr w:type="spellStart"/>
-      <w:r>
-        <w:rPr>
-          <w:rFonts w:ascii="Times New Roman" w:hAnsi="Times New Roman" w:cs="Times New Roman"/>
-          <w:color w:val="222222"/>
+          <w:sz w:val="24"/>
+          <w:szCs w:val="24"/>
+        </w:rPr>
+        <w:t xml:space="preserve">, </w:t>
+      </w:r>
+      <w:proofErr w:type="spellStart"/>
+      <w:r>
+        <w:rPr>
+          <w:rFonts w:ascii="Times New Roman" w:hAnsi="Times New Roman" w:cs="Times New Roman"/>
+          <w:color w:val="222222"/>
+          <w:sz w:val="24"/>
+          <w:szCs w:val="24"/>
+        </w:rPr>
+        <w:t>termasuk</w:t>
+      </w:r>
+      <w:proofErr w:type="spellEnd"/>
+      <w:r>
+        <w:rPr>
+          <w:rFonts w:ascii="Times New Roman" w:hAnsi="Times New Roman" w:cs="Times New Roman"/>
+          <w:color w:val="222222"/>
+          <w:sz w:val="24"/>
+          <w:szCs w:val="24"/>
+        </w:rPr>
+        <w:t xml:space="preserve"> Home, </w:t>
+      </w:r>
+      <w:proofErr w:type="spellStart"/>
+      <w:r>
+        <w:rPr>
+          <w:rFonts w:ascii="Times New Roman" w:hAnsi="Times New Roman" w:cs="Times New Roman"/>
+          <w:color w:val="222222"/>
+          <w:sz w:val="24"/>
+          <w:szCs w:val="24"/>
         </w:rPr>
         <w:t>tampil</w:t>
       </w:r>
@@ -9622,15 +10108,143 @@
         <w:rPr>
           <w:rFonts w:ascii="Times New Roman" w:hAnsi="Times New Roman" w:cs="Times New Roman"/>
           <w:color w:val="222222"/>
-        </w:rPr>
-        <w:t xml:space="preserve"> di chart dan legend.</w:t>
+          <w:sz w:val="24"/>
+          <w:szCs w:val="24"/>
+        </w:rPr>
+        <w:t xml:space="preserve"> </w:t>
+      </w:r>
+      <w:proofErr w:type="spellStart"/>
+      <w:r>
+        <w:rPr>
+          <w:rFonts w:ascii="Times New Roman" w:hAnsi="Times New Roman" w:cs="Times New Roman"/>
+          <w:color w:val="222222"/>
+          <w:sz w:val="24"/>
+          <w:szCs w:val="24"/>
+        </w:rPr>
+        <w:t>tanpa</w:t>
+      </w:r>
+      <w:proofErr w:type="spellEnd"/>
+      <w:r>
+        <w:rPr>
+          <w:rFonts w:ascii="Times New Roman" w:hAnsi="Times New Roman" w:cs="Times New Roman"/>
+          <w:color w:val="222222"/>
+          <w:sz w:val="24"/>
+          <w:szCs w:val="24"/>
+        </w:rPr>
+        <w:t xml:space="preserve"> scroll; wilayah </w:t>
+      </w:r>
+      <w:proofErr w:type="spellStart"/>
+      <w:r>
+        <w:rPr>
+          <w:rFonts w:ascii="Times New Roman" w:hAnsi="Times New Roman" w:cs="Times New Roman"/>
+          <w:color w:val="222222"/>
+          <w:sz w:val="24"/>
+          <w:szCs w:val="24"/>
+        </w:rPr>
+        <w:t>memakai</w:t>
+      </w:r>
+      <w:proofErr w:type="spellEnd"/>
+      <w:r>
+        <w:rPr>
+          <w:rFonts w:ascii="Times New Roman" w:hAnsi="Times New Roman" w:cs="Times New Roman"/>
+          <w:color w:val="222222"/>
+          <w:sz w:val="24"/>
+          <w:szCs w:val="24"/>
+        </w:rPr>
+        <w:t xml:space="preserve"> dropdown; </w:t>
+      </w:r>
+      <w:proofErr w:type="spellStart"/>
+      <w:r>
+        <w:rPr>
+          <w:rFonts w:ascii="Times New Roman" w:hAnsi="Times New Roman" w:cs="Times New Roman"/>
+          <w:color w:val="222222"/>
+          <w:sz w:val="24"/>
+          <w:szCs w:val="24"/>
+        </w:rPr>
+        <w:t>tahun</w:t>
+      </w:r>
+      <w:proofErr w:type="spellEnd"/>
+      <w:r>
+        <w:rPr>
+          <w:rFonts w:ascii="Times New Roman" w:hAnsi="Times New Roman" w:cs="Times New Roman"/>
+          <w:color w:val="222222"/>
+          <w:sz w:val="24"/>
+          <w:szCs w:val="24"/>
+        </w:rPr>
+        <w:t xml:space="preserve"> </w:t>
+      </w:r>
+      <w:proofErr w:type="spellStart"/>
+      <w:r>
+        <w:rPr>
+          <w:rFonts w:ascii="Times New Roman" w:hAnsi="Times New Roman" w:cs="Times New Roman"/>
+          <w:color w:val="222222"/>
+          <w:sz w:val="24"/>
+          <w:szCs w:val="24"/>
+        </w:rPr>
+        <w:t>diganti</w:t>
+      </w:r>
+      <w:proofErr w:type="spellEnd"/>
+      <w:r>
+        <w:rPr>
+          <w:rFonts w:ascii="Times New Roman" w:hAnsi="Times New Roman" w:cs="Times New Roman"/>
+          <w:color w:val="222222"/>
+          <w:sz w:val="24"/>
+          <w:szCs w:val="24"/>
+        </w:rPr>
+        <w:t xml:space="preserve"> slicer </w:t>
+      </w:r>
+      <w:proofErr w:type="spellStart"/>
+      <w:r>
+        <w:rPr>
+          <w:rFonts w:ascii="Times New Roman" w:hAnsi="Times New Roman" w:cs="Times New Roman"/>
+          <w:color w:val="222222"/>
+          <w:sz w:val="24"/>
+          <w:szCs w:val="24"/>
+        </w:rPr>
+        <w:t>rentang</w:t>
+      </w:r>
+      <w:proofErr w:type="spellEnd"/>
+      <w:r>
+        <w:rPr>
+          <w:rFonts w:ascii="Times New Roman" w:hAnsi="Times New Roman" w:cs="Times New Roman"/>
+          <w:color w:val="222222"/>
+          <w:sz w:val="24"/>
+          <w:szCs w:val="24"/>
+        </w:rPr>
+        <w:t xml:space="preserve"> </w:t>
+      </w:r>
+      <w:proofErr w:type="spellStart"/>
+      <w:r>
+        <w:rPr>
+          <w:rFonts w:ascii="Times New Roman" w:hAnsi="Times New Roman" w:cs="Times New Roman"/>
+          <w:color w:val="222222"/>
+          <w:sz w:val="24"/>
+          <w:szCs w:val="24"/>
+        </w:rPr>
+        <w:t>tanggal</w:t>
+      </w:r>
+      <w:proofErr w:type="spellEnd"/>
+      <w:r>
+        <w:rPr>
+          <w:rFonts w:ascii="Times New Roman" w:hAnsi="Times New Roman" w:cs="Times New Roman"/>
+          <w:color w:val="222222"/>
+          <w:sz w:val="24"/>
+          <w:szCs w:val="24"/>
+        </w:rPr>
+        <w:t>.</w:t>
       </w:r>
     </w:p>
     <w:p>
       <w:pPr>
         <w:pStyle w:val="Heading1"/>
+        <w:rPr>
+          <w:rFonts w:cs="Times New Roman"/>
+        </w:rPr>
       </w:pPr>
       <w:r>
+        <w:rPr>
+          <w:rFonts w:cs="Times New Roman"/>
+        </w:rPr>
         <w:t>F. Kesimpulan</w:t>
       </w:r>
     </w:p>
@@ -10750,10 +11364,10 @@
 <file path=word/numbering.xml><?xml version="1.0" encoding="utf-8"?>
 <w:numbering xmlns:wpc="http://schemas.microsoft.com/office/word/2010/wordprocessingCanvas" xmlns:cx="http://schemas.microsoft.com/office/drawing/2014/chartex" xmlns:cx1="http://schemas.microsoft.com/office/drawing/2015/9/8/chartex" xmlns:cx2="http://schemas.microsoft.com/office/drawing/2015/10/21/chartex" xmlns:cx3="http://schemas.microsoft.com/office/drawing/2016/5/9/chartex" xmlns:cx4="http://schemas.microsoft.com/office/drawing/2016/5/10/chartex" xmlns:cx5="http://schemas.microsoft.com/office/drawing/2016/5/11/chartex" xmlns:cx6="http://schemas.microsoft.com/office/drawing/2016/5/12/chartex" xmlns:cx7="http://schemas.microsoft.com/office/drawing/2016/5/13/chartex" xmlns:cx8="http://schemas.microsoft.com/office/drawing/2016/5/14/chartex" xmlns:mc="http://schemas.openxmlformats.org/markup-compatibility/2006" xmlns:aink="http://schemas.microsoft.com/office/drawing/2016/ink" xmlns:am3d="http://schemas.microsoft.com/office/drawing/2017/model3d" xmlns:o="urn:schemas-microsoft-com:office:office" xmlns:oel="http://schemas.microsoft.com/office/2019/extlst" xmlns:r="http://schemas.openxmlformats.org/officeDocument/2006/relationships" xmlns:m="http://schemas.openxmlformats.org/officeDocument/2006/math" xmlns:v="urn:schemas-microsoft-com:vml" xmlns:wp14="http://schemas.microsoft.com/office/word/2010/wordprocessingDrawing" xmlns:wp="http://schemas.openxmlformats.org/drawingml/2006/wordprocessingDrawing" xmlns:w10="urn:schemas-microsoft-com:office:word" xmlns:w="http://schemas.openxmlformats.org/wordprocessingml/2006/main" xmlns:w14="http://schemas.microsoft.com/office/word/2010/wordml" xmlns:w15="http://schemas.microsoft.com/office/word/2012/wordml" xmlns:w16cex="http://schemas.microsoft.com/office/word/2018/wordml/cex" xmlns:w16cid="http://schemas.microsoft.com/office/word/2016/wordml/cid" xmlns:w16="http://schemas.microsoft.com/office/word/2018/wordml" xmlns:w16du="http://schemas.microsoft.com/office/word/2023/wordml/word16du" xmlns:w16sdtdh="http://schemas.microsoft.com/office/word/2020/wordml/sdtdatahash" xmlns:w16sdtfl="http://schemas.microsoft.com/office/word/2024/wordml/sdtformatlock" xmlns:w16se="http://schemas.microsoft.com/office/word/2015/wordml/symex" xmlns:wpg="http://schemas.microsoft.com/office/word/2010/wordprocessingGroup" xmlns:wpi="http://schemas.microsoft.com/office/word/2010/wordprocessingInk" xmlns:wne="http://schemas.microsoft.com/office/word/2006/wordml" xmlns:wps="http://schemas.microsoft.com/office/word/2010/wordprocessingShape" mc:Ignorable="w14 w15 w16se w16cid w16 w16cex w16sdtdh w16sdtfl w16du wp14">
   <w:abstractNum w:abstractNumId="0" w15:restartNumberingAfterBreak="0">
-    <w:nsid w:val="1E7237EC"/>
+    <w:nsid w:val="081419A5"/>
     <w:multiLevelType w:val="hybridMultilevel"/>
-    <w:tmpl w:val="AAB432B2"/>
-    <w:lvl w:ilvl="0" w:tplc="4258B3BA" w:tentative="1">
+    <w:tmpl w:val="F0CEC744"/>
+    <w:lvl w:ilvl="0" w:tplc="2D489ED4" w:tentative="1">
       <w:start w:val="1"/>
       <w:numFmt w:val="bullet"/>
       <w:lvlText w:val="●"/>
@@ -10762,7 +11376,7 @@
         <w:ind w:left="720" w:hanging="360"/>
       </w:pPr>
     </w:lvl>
-    <w:lvl w:ilvl="1" w:tplc="5E44CA82" w:tentative="1">
+    <w:lvl w:ilvl="1" w:tplc="96303686" w:tentative="1">
       <w:start w:val="1"/>
       <w:numFmt w:val="bullet"/>
       <w:lvlText w:val="○"/>
@@ -10771,7 +11385,7 @@
         <w:ind w:left="1440" w:hanging="360"/>
       </w:pPr>
     </w:lvl>
-    <w:lvl w:ilvl="2" w:tplc="87C8A98A" w:tentative="1">
+    <w:lvl w:ilvl="2" w:tplc="2A5C825C" w:tentative="1">
       <w:start w:val="1"/>
       <w:numFmt w:val="bullet"/>
       <w:lvlText w:val="■"/>
@@ -10780,7 +11394,7 @@
         <w:ind w:left="2160" w:hanging="360"/>
       </w:pPr>
     </w:lvl>
-    <w:lvl w:ilvl="3" w:tplc="8F3423C6" w:tentative="1">
+    <w:lvl w:ilvl="3" w:tplc="6B5C0B24" w:tentative="1">
       <w:start w:val="1"/>
       <w:numFmt w:val="bullet"/>
       <w:lvlText w:val="●"/>
@@ -10789,7 +11403,7 @@
         <w:ind w:left="2880" w:hanging="360"/>
       </w:pPr>
     </w:lvl>
-    <w:lvl w:ilvl="4" w:tplc="D466CD2E" w:tentative="1">
+    <w:lvl w:ilvl="4" w:tplc="D29065BE" w:tentative="1">
       <w:start w:val="1"/>
       <w:numFmt w:val="bullet"/>
       <w:lvlText w:val="○"/>
@@ -10798,7 +11412,7 @@
         <w:ind w:left="3600" w:hanging="360"/>
       </w:pPr>
     </w:lvl>
-    <w:lvl w:ilvl="5" w:tplc="E8E66A1E" w:tentative="1">
+    <w:lvl w:ilvl="5" w:tplc="C1F0B7B2" w:tentative="1">
       <w:start w:val="1"/>
       <w:numFmt w:val="bullet"/>
       <w:lvlText w:val="■"/>
@@ -10807,7 +11421,7 @@
         <w:ind w:left="4320" w:hanging="360"/>
       </w:pPr>
     </w:lvl>
-    <w:lvl w:ilvl="6" w:tplc="7E307846" w:tentative="1">
+    <w:lvl w:ilvl="6" w:tplc="CC406900" w:tentative="1">
       <w:start w:val="1"/>
       <w:numFmt w:val="bullet"/>
       <w:lvlText w:val="●"/>
@@ -10816,7 +11430,7 @@
         <w:ind w:left="5040" w:hanging="360"/>
       </w:pPr>
     </w:lvl>
-    <w:lvl w:ilvl="7" w:tplc="A4B2B8CC" w:tentative="1">
+    <w:lvl w:ilvl="7" w:tplc="B858B906" w:tentative="1">
       <w:start w:val="1"/>
       <w:numFmt w:val="bullet"/>
       <w:lvlText w:val="●"/>
@@ -10825,7 +11439,7 @@
         <w:ind w:left="5760" w:hanging="360"/>
       </w:pPr>
     </w:lvl>
-    <w:lvl w:ilvl="8" w:tplc="1A686DF2" w:tentative="1">
+    <w:lvl w:ilvl="8" w:tplc="B84A94B4" w:tentative="1">
       <w:start w:val="1"/>
       <w:numFmt w:val="bullet"/>
       <w:lvlText w:val="●"/>
@@ -10836,10 +11450,10 @@
     </w:lvl>
   </w:abstractNum>
   <w:abstractNum w:abstractNumId="1" w15:restartNumberingAfterBreak="0">
-    <w:nsid w:val="4E1D7C4D"/>
+    <w:nsid w:val="10A007C4"/>
     <w:multiLevelType w:val="hybridMultilevel"/>
-    <w:tmpl w:val="C4240D3E"/>
-    <w:lvl w:ilvl="0" w:tplc="4C6E6B72">
+    <w:tmpl w:val="136EDA28"/>
+    <w:lvl w:ilvl="0" w:tplc="CB44843E">
       <w:start w:val="1"/>
       <w:numFmt w:val="decimal"/>
       <w:lvlText w:val="%1."/>
@@ -10848,52 +11462,52 @@
         <w:ind w:left="420" w:hanging="360"/>
       </w:pPr>
     </w:lvl>
-    <w:lvl w:ilvl="1" w:tplc="59043F48">
+    <w:lvl w:ilvl="1" w:tplc="BCF6DE5E">
       <w:numFmt w:val="decimal"/>
       <w:lvlText w:val=""/>
       <w:lvlJc w:val="left"/>
     </w:lvl>
-    <w:lvl w:ilvl="2" w:tplc="1DC0B804">
+    <w:lvl w:ilvl="2" w:tplc="36B8B22C">
       <w:numFmt w:val="decimal"/>
       <w:lvlText w:val=""/>
       <w:lvlJc w:val="left"/>
     </w:lvl>
-    <w:lvl w:ilvl="3" w:tplc="1F3A33F2">
+    <w:lvl w:ilvl="3" w:tplc="D20A4AF2">
       <w:numFmt w:val="decimal"/>
       <w:lvlText w:val=""/>
       <w:lvlJc w:val="left"/>
     </w:lvl>
-    <w:lvl w:ilvl="4" w:tplc="4B8E19F6">
+    <w:lvl w:ilvl="4" w:tplc="7D72240C">
       <w:numFmt w:val="decimal"/>
       <w:lvlText w:val=""/>
       <w:lvlJc w:val="left"/>
     </w:lvl>
-    <w:lvl w:ilvl="5" w:tplc="6EEA6CAC">
+    <w:lvl w:ilvl="5" w:tplc="5EF2FA00">
       <w:numFmt w:val="decimal"/>
       <w:lvlText w:val=""/>
       <w:lvlJc w:val="left"/>
     </w:lvl>
-    <w:lvl w:ilvl="6" w:tplc="8E5CD4B8">
+    <w:lvl w:ilvl="6" w:tplc="9C1455F8">
       <w:numFmt w:val="decimal"/>
       <w:lvlText w:val=""/>
       <w:lvlJc w:val="left"/>
     </w:lvl>
-    <w:lvl w:ilvl="7" w:tplc="22603554">
+    <w:lvl w:ilvl="7" w:tplc="7D9C3B20">
       <w:numFmt w:val="decimal"/>
       <w:lvlText w:val=""/>
       <w:lvlJc w:val="left"/>
     </w:lvl>
-    <w:lvl w:ilvl="8" w:tplc="461C2036">
+    <w:lvl w:ilvl="8" w:tplc="ACA02930">
       <w:numFmt w:val="decimal"/>
       <w:lvlText w:val=""/>
       <w:lvlJc w:val="left"/>
     </w:lvl>
   </w:abstractNum>
   <w:abstractNum w:abstractNumId="2" w15:restartNumberingAfterBreak="0">
-    <w:nsid w:val="7CD41B52"/>
+    <w:nsid w:val="3A5467C7"/>
     <w:multiLevelType w:val="hybridMultilevel"/>
-    <w:tmpl w:val="7D3244AE"/>
-    <w:lvl w:ilvl="0" w:tplc="2A323614" w:tentative="1">
+    <w:tmpl w:val="F28EC040"/>
+    <w:lvl w:ilvl="0" w:tplc="F724AA98" w:tentative="1">
       <w:start w:val="1"/>
       <w:numFmt w:val="bullet"/>
       <w:lvlText w:val="•"/>
@@ -10902,54 +11516,54 @@
         <w:ind w:left="420" w:hanging="240"/>
       </w:pPr>
     </w:lvl>
-    <w:lvl w:ilvl="1" w:tplc="ED00D3EC">
+    <w:lvl w:ilvl="1" w:tplc="20141CDA">
       <w:numFmt w:val="decimal"/>
       <w:lvlText w:val=""/>
       <w:lvlJc w:val="left"/>
     </w:lvl>
-    <w:lvl w:ilvl="2" w:tplc="A508A314">
+    <w:lvl w:ilvl="2" w:tplc="37B44B3A">
       <w:numFmt w:val="decimal"/>
       <w:lvlText w:val=""/>
       <w:lvlJc w:val="left"/>
     </w:lvl>
-    <w:lvl w:ilvl="3" w:tplc="BA361972">
+    <w:lvl w:ilvl="3" w:tplc="6D0CBFC0">
       <w:numFmt w:val="decimal"/>
       <w:lvlText w:val=""/>
       <w:lvlJc w:val="left"/>
     </w:lvl>
-    <w:lvl w:ilvl="4" w:tplc="99D03588">
+    <w:lvl w:ilvl="4" w:tplc="B0B2513A">
       <w:numFmt w:val="decimal"/>
       <w:lvlText w:val=""/>
       <w:lvlJc w:val="left"/>
     </w:lvl>
-    <w:lvl w:ilvl="5" w:tplc="11F68286">
+    <w:lvl w:ilvl="5" w:tplc="79D8D2C4">
       <w:numFmt w:val="decimal"/>
       <w:lvlText w:val=""/>
       <w:lvlJc w:val="left"/>
     </w:lvl>
-    <w:lvl w:ilvl="6" w:tplc="CA629E84">
+    <w:lvl w:ilvl="6" w:tplc="3CA84534">
       <w:numFmt w:val="decimal"/>
       <w:lvlText w:val=""/>
       <w:lvlJc w:val="left"/>
     </w:lvl>
-    <w:lvl w:ilvl="7" w:tplc="C54C8DB2">
+    <w:lvl w:ilvl="7" w:tplc="5ABE80EC">
       <w:numFmt w:val="decimal"/>
       <w:lvlText w:val=""/>
       <w:lvlJc w:val="left"/>
     </w:lvl>
-    <w:lvl w:ilvl="8" w:tplc="75B40530">
+    <w:lvl w:ilvl="8" w:tplc="5B1CDD92">
       <w:numFmt w:val="decimal"/>
       <w:lvlText w:val=""/>
       <w:lvlJc w:val="left"/>
     </w:lvl>
   </w:abstractNum>
-  <w:num w:numId="1" w16cid:durableId="51318673">
+  <w:num w:numId="1" w16cid:durableId="459034954">
     <w:abstractNumId w:val="0"/>
     <w:lvlOverride w:ilvl="0">
       <w:startOverride w:val="1"/>
     </w:lvlOverride>
   </w:num>
-  <w:num w:numId="2" w16cid:durableId="1995066164">
+  <w:num w:numId="2" w16cid:durableId="1128014198">
     <w:abstractNumId w:val="1"/>
     <w:lvlOverride w:ilvl="0">
       <w:startOverride w:val="1"/>
@@ -11359,7 +11973,7 @@
     <w:next w:val="Normal"/>
     <w:uiPriority w:val="9"/>
     <w:qFormat/>
-    <w:rsid w:val="00BB1374"/>
+    <w:rsid w:val="00405924"/>
     <w:pPr>
       <w:pBdr>
         <w:bottom w:val="single" w:sz="12" w:space="4" w:color="1F4E79"/>
@@ -11368,7 +11982,7 @@
       <w:outlineLvl w:val="0"/>
     </w:pPr>
     <w:rPr>
-      <w:rFonts w:ascii="Times New Roman" w:hAnsi="Times New Roman" w:cs="Times New Roman"/>
+      <w:rFonts w:ascii="Times New Roman" w:hAnsi="Times New Roman"/>
       <w:b/>
       <w:bCs/>
       <w:color w:val="000000" w:themeColor="text1"/>
@@ -11378,19 +11992,18 @@
   </w:style>
   <w:style w:type="paragraph" w:styleId="Heading2">
     <w:name w:val="heading 2"/>
-    <w:basedOn w:val="Normal"/>
+    <w:basedOn w:val="Heading1"/>
     <w:next w:val="Normal"/>
     <w:uiPriority w:val="9"/>
-    <w:semiHidden/>
     <w:unhideWhenUsed/>
     <w:qFormat/>
+    <w:rsid w:val="00405924"/>
     <w:pPr>
       <w:outlineLvl w:val="1"/>
     </w:pPr>
     <w:rPr>
-      <w:color w:val="2E74B5"/>
-      <w:sz w:val="26"/>
-      <w:szCs w:val="26"/>
+      <w:b w:val="0"/>
+      <w:bCs w:val="0"/>
     </w:rPr>
   </w:style>
   <w:style w:type="paragraph" w:styleId="Heading3">
@@ -11589,7 +12202,7 @@
     <w:link w:val="HeaderChar"/>
     <w:uiPriority w:val="99"/>
     <w:unhideWhenUsed/>
-    <w:rsid w:val="00BB1374"/>
+    <w:rsid w:val="00405924"/>
     <w:pPr>
       <w:tabs>
         <w:tab w:val="center" w:pos="4513"/>
@@ -11602,7 +12215,7 @@
     <w:basedOn w:val="DefaultParagraphFont"/>
     <w:link w:val="Header"/>
     <w:uiPriority w:val="99"/>
-    <w:rsid w:val="00BB1374"/>
+    <w:rsid w:val="00405924"/>
   </w:style>
   <w:style w:type="paragraph" w:styleId="Footer">
     <w:name w:val="footer"/>
@@ -11610,7 +12223,7 @@
     <w:link w:val="FooterChar"/>
     <w:uiPriority w:val="99"/>
     <w:unhideWhenUsed/>
-    <w:rsid w:val="00BB1374"/>
+    <w:rsid w:val="00405924"/>
     <w:pPr>
       <w:tabs>
         <w:tab w:val="center" w:pos="4513"/>
@@ -11623,7 +12236,7 @@
     <w:basedOn w:val="DefaultParagraphFont"/>
     <w:link w:val="Footer"/>
     <w:uiPriority w:val="99"/>
-    <w:rsid w:val="00BB1374"/>
+    <w:rsid w:val="00405924"/>
   </w:style>
 </w:styles>
 </file>

</xml_diff>